<commit_message>
Proofcheck Flour Play Romanian: SIGNIFICANT (55 edits)
Co-Authored-By: Claude Opus 5.5 <noreply@anthropic.com>
Claude-Session: https://claude.ai/code/session_012Cm8JxdqzjuttdUSdkQCUg
</commit_message>
<xml_diff>
--- a/translated/corrected/Flour Play - ASSEMBLED - FORMATTED_Romanian.docx
+++ b/translated/corrected/Flour Play - ASSEMBLED - FORMATTED_Romanian.docx
@@ -120,19 +120,19 @@
     <w:p/>
     <w:p>
       <w:r>
-        <w:t>Greta a făcut exact același rulou cu scorțișoară timp de patruzeci de ani. A făcut-o în dimineața de după înmormântarea soțului ei, pentru că nu știa ce altceva să facă cu mâinile. Săptămâna aceasta, iese din cuptor acră, la fel și următoarea șarjă, și cea de după ea.</w:t>
-      </w:r>
-    </w:p>
-    <w:p/>
-    <w:p>
-      <w:r>
-        <w:t>Făină nouă. Apă nouă. Un cântar împrumutat. Tot acră. Până joi, Greta stă în propria ei brutărie și îi spune lui Jessica Claus că mâinile ei au uitat în sfârșit cum se face.</w:t>
-      </w:r>
-    </w:p>
-    <w:p/>
-    <w:p>
-      <w:r>
-        <w:t>Apoi o cărămidă sparge geamul, iar un cuvânt apare scris cu roșu pe scândurile pereților, acolo unde fiecare copil de pe Evergreen Avenue îl va citi în trecere.</w:t>
+        <w:t xml:space="preserve">Greta a făcut exact același rulou cu scorțișoară timp de patruzeci de ani. L-a făcut în dimineața de după înmormântarea soțului ei, pentru că nu știa ce altceva să facă cu mâinile. Săptămâna aceasta, iese din cuptor acru, la fel și următoarea șarjă, și cea de după ea.</w:t>
+      </w:r>
+    </w:p>
+    <w:p/>
+    <w:p>
+      <w:r>
+        <w:t xml:space="preserve">Făină nouă. Apă nouă. Un cântar împrumutat. Tot acru. Până joi, Greta stă în propria ei brutărie și îi spune lui Jessica Claus că mâinile ei au uitat în sfârșit cum se face.</w:t>
+      </w:r>
+    </w:p>
+    <w:p/>
+    <w:p>
+      <w:r>
+        <w:t xml:space="preserve">Apoi o cărămidă sparge geamul, iar un cuvânt apare scris cu roșu pe scândurile pereților, acolo unde fiecare copil de pe Bulevardul Evergreen îl va citi în trecere.</w:t>
       </w:r>
     </w:p>
     <w:p/>
@@ -170,7 +170,7 @@
     <w:p/>
     <w:p>
       <w:r>
-        <w:t>Ninsese în timpul nopții. Nu ninsoarea aia timpurie din octombrie, care dispăruse iar într-o serie de zile blânde. Zăpadă adevărată. Genul acela din mijlocul sezonului care începuse de Halloween și avea să țină până în primăvară. Se așeza acum de-a lungul bulevardului Evergreen într-un strat frumos și curat de vreo cinsprezece centimetri, scârțâind sub tălpi când intra cineva bătând din picioare. Peste noapte, magazinele începuseră să schimbe scheleții și felinarele dovleac pe coceni de porumb și curcani de hârtie, deși dovlecii simpli rămăseseră pe trepte, buni până de Ziua Recunoștinței. Bulevardul se liniștise după Halloween, în pauza dinaintea lungului și strălucitorului avânt spre Crăciun.</w:t>
+        <w:t xml:space="preserve">Ninsese în timpul nopții. Nu ninsoarea aia timpurie din octombrie, care dispăruse iar într-o serie de zile blânde. Zăpadă adevărată. Genul acela din mijlocul sezonului care începuse de Halloween și avea să țină până în primăvară. Se așeza acum de-a lungul Bulevardului Evergreen într-un strat frumos și curat de vreo cinsprezece centimetri, scârțâind sub tălpi când intra cineva bătând din picioare. Peste noapte, magazinele începuseră să schimbe scheleții și felinarele dovleac pe coceni de porumb și curcani de hârtie, deși dovlecii simpli rămăseseră pe trepte, buni până de Ziua Recunoștinței. Bulevardul se liniștise după Halloween, în pauza dinaintea lungului și strălucitorului avânt spre Crăciun.</w:t>
       </w:r>
     </w:p>
     <w:p/>
@@ -224,7 +224,7 @@
     <w:p/>
     <w:p>
       <w:r>
-        <w:t xml:space="preserve">Dot a scos râsul ei scurt și sec din celălalt capăt al cercului, fără să ridice ochii de la coronița ei, care era deja pe jumătate mai mare decât a oricui altcuiva și de două ori mai deasă. </w:t>
+        <w:t xml:space="preserve">Dot a scos râsul ei scurt și sec din celălalt capăt al cercului, fără să ridice ochii de la coronița ei, care era deja cu jumătate mai mare decât a oricui altcuiva și de două ori mai deasă. </w:t>
       </w:r>
     </w:p>
     <w:p/>
@@ -302,7 +302,7 @@
     <w:p/>
     <w:p>
       <w:r>
-        <w:t>A lăsat jos o cutie de prăjituri cât o cutie de pălării pe masă, între conurile de pin și panglică, și și-a pus pumnii în șolduri ca să ne studieze. Greta deținea brutăria Holly Jolly Bakery de pe bulevard și era construită ca gogoșile ei, rotundă și pudrată toată. Dimineața asta avea făină pe tot șorțul, pe care nu se ostenise s-o perie.</w:t>
+        <w:t xml:space="preserve">A lăsat jos o cutie de prăjituri cât o cutie de pălării pe masă, între conurile de pin și panglică, și și-a pus pumnii în șolduri ca să ne studieze. Greta deținea brutăria Holly Jolly de pe bulevard și era construită ca gogoșile ei, rotundă și pudrată toată. Dimineața asta avea făină pe tot șorțul, pe care nu se ostenise s-o perie.</w:t>
       </w:r>
     </w:p>
     <w:p/>
@@ -362,7 +362,7 @@
     <w:p/>
     <w:p>
       <w:r>
-        <w:t>— Coronițe de ușă pentru magazine, a spus Olivia. Plătesc cât vor, și fiecare bănuț se duce la fondul pentru acoperiș al Societății Istorice. A lui Ivy e pentru biserică, iar a lui Ellie e pentru spital. Pe astea două le dăruim.</w:t>
+        <w:t xml:space="preserve">— Coronițe de ușă pentru magazine, a spus Olivia. Plătesc cât vor, și fiecare bănuț se duce la fondul pentru acoperiș al Societății de Istorie. A lui Ivy e pentru biserică, iar a lui Ellie e pentru spital. Pe astea două le dăruim.</w:t>
       </w:r>
     </w:p>
     <w:p/>
@@ -386,7 +386,7 @@
     <w:p/>
     <w:p>
       <w:r>
-        <w:t>Asta a atras atenția cercului de la sârmă. Vechiul local Fenwick stătuse gol un an bun, cu ferestrele întunecate la capătul unui bloc luminos. Era genul de gol dintr-un șir de magazine pe care oamenii învață să nu se uite, ca să nu simtă mica înțepătură a acestuia.</w:t>
+        <w:t xml:space="preserve">Asta a atras atenția cercului de la sârmă. Vechiul local Fenwick stătuse gol un an bun, cu ferestrele întunecate la capătul unui șir luminos de prăvălii. Era genul de gol dintr-un șir de magazine pe care oamenii învață să nu se uite, ca să nu simtă mica înțepătură a acestuia.</w:t>
       </w:r>
     </w:p>
     <w:p/>
@@ -464,7 +464,7 @@
     <w:p/>
     <w:p>
       <w:r>
-        <w:t>Stătea acum cu spatele la drum, cu brațele de bețe aruncate în lături, cu chipul noduros de cărbune îndreptat în sus pe pajiște spre magazine. Spre, dacă voiai să fii exact în privința asta, capătul îndepărtat al blocului unde vechiul local Fenwick stătea în spatele hârtiei sale maro. Ceilalți doi erau tot cu fața la stradă. Doar cel din mijloc se mișcase. Se întorsese trupește pe baza lui ca să se uite în cealaltă parte. Și nu era nicio urmă de pași pe nicăieri pe lângă el. Zăpada din jurul tuturor celor trei era netedă și neatinsă. Vreo cincisprezece centimetri de cădere proaspătă de noapte, fără nimic scris în ea în afară de umbra lungă și albastră a monumentului eroilor.</w:t>
+        <w:t xml:space="preserve">Stătea acum cu spatele la drum, cu brațele de bețe aruncate în lături, cu chipul noduros de cărbune îndreptat în sus pe pajiște spre magazine. Spre, dacă voiai să fii exact în privința asta, capătul îndepărtat al șirului de prăvălii unde vechiul local Fenwick stătea în spatele hârtiei sale maro. Ceilalți doi erau tot cu fața la stradă. Doar cel din mijloc se mișcase. Se întorsese trupește pe baza lui ca să se uite în cealaltă parte. Și nu era nicio urmă de pași pe nicăieri pe lângă el. Zăpada din jurul tuturor celor trei era netedă și neatinsă. Vreo cincisprezece centimetri de cădere proaspătă de noapte, fără nimic scris în ea în afară de umbra lungă și albastră a monumentului eroilor.</w:t>
       </w:r>
     </w:p>
     <w:p/>
@@ -488,7 +488,7 @@
     <w:p/>
     <w:p>
       <w:r>
-        <w:t>— Le-au periat în urma lor, a spus Dot. Sau vântul le-a umplut. E o glumă. Un copil cu degete înghețate care n-are altceva mai bun de făcut. O să fie un rând întreg întoarse până în weekend, să te uiți, odată ce ceilalți văd că se poate face.</w:t>
+        <w:t xml:space="preserve">— Le-au periat în urma lor, a spus Dot. Sau vântul le-a umplut. E o glumă. Un copil cu degete înghețate care n-are altceva mai bun de făcut. O să fie un rând întreg întors până în weekend, să te uiți, odată ce ceilalți văd că se poate face.</w:t>
       </w:r>
     </w:p>
     <w:p/>
@@ -500,7 +500,7 @@
     <w:p/>
     <w:p>
       <w:r>
-        <w:t>Și aia a fost perspectiva de bun-simț, și cercul a acceptat-o, și cineva a spus copiii de azi și altcineva a spus că nu ningea niciodată așa când eram eu fată, și discuția a mers mai departe, așa cum o face vorba de cerc, iar Ivy s-a întors după încă un biscuit cu ghimbir. Dar am stat la fereastră o clipă mai mult decât celelalte, cu coronița mea pe jumătate făcută în mână. M-am uitat la omul de zăpadă din mijloc care privea în sus pe bloc. M-am uitat la zăpada netedă și neatinsă pe care nu o atinseseră ghetele vreunui șugubăț.</w:t>
+        <w:t xml:space="preserve">Și aia a fost perspectiva de bun-simț, și cercul a acceptat-o, și cineva a spus copiii de azi și altcineva a spus că nu ningea niciodată așa când eram eu fată, și discuția a mers mai departe, așa cum o face vorba de cerc, iar Ivy s-a întors după încă un biscuit cu ghimbir. Dar am stat la fereastră o clipă mai mult decât celelalte, cu coronița mea pe jumătate făcută în mână. M-am uitat la omul de zăpadă din mijloc care privea în susul străzii. M-am uitat la zăpada netedă și neatinsă pe care nu o atinseseră ghetele vreunui șugubăț.</w:t>
       </w:r>
     </w:p>
     <w:p/>
@@ -512,7 +512,7 @@
     <w:p/>
     <w:p>
       <w:r>
-        <w:t>M-am uitat de la omul de zăpadă întors în sus pe bloc spre ferestrele acoperite cu hârtie maro ale vechiului local Fenwick, exact acolo unde indicau brațele lui de bețe.</w:t>
+        <w:t xml:space="preserve">M-am uitat de la omul de zăpadă întors, în susul străzii, spre ferestrele acoperite cu hârtie maro ale vechiului local Fenwick, exact acolo unde indicau brațele lui de bețe.</w:t>
       </w:r>
     </w:p>
     <w:p/>
@@ -1154,7 +1154,7 @@
     <w:p/>
     <w:p>
       <w:r>
-        <w:t>— Încă o tură, a spus ea înainte ca eu să fi închis ușa. Am făcut-o încet. Am cântărit totul de două ori pe un cântar luat cu împrumut de la Hal, în caz că al meu o luase razna. Făină nouă dintr-un sac pe care l-am deschis la patru și l-am lăsat lângă ușa din spate în timp ce se încălzeau cuptoarele. Nu din ladă. Dacă asta iese cum trebuie, înseamnă că ultimele zile au fost doar o toană a vremii, că mi-am recăpătat sezonul și că nu vom mai vorbi niciodată despre asta.</w:t>
+        <w:t xml:space="preserve">— Încă o șarjă, a spus ea înainte ca eu să fi închis ușa. Am făcut-o încet. Am cântărit totul de două ori pe un cântar luat cu împrumut de la Hal, în caz că al meu o luase razna. Făină nouă dintr-un sac pe care l-am deschis la patru și l-am lăsat lângă ușa din spate în timp ce se încălzeau cuptoarele. Nu din ladă. Dacă asta iese cum trebuie, înseamnă că ultimele zile au fost doar o toană a vremii, că mi-am recăpătat sezonul și că nu vom mai vorbi niciodată despre asta.</w:t>
       </w:r>
     </w:p>
     <w:p/>
@@ -1226,7 +1226,7 @@
     <w:p/>
     <w:p>
       <w:r>
-        <w:t>Mi-am pus paltonul și am chemat-o pe Pip, care a simțit schimbarea din vocea mea și a venit imediat. Am luat-o amândouă pe Evergreen Avenue într-un pas care m-a lăsat fără suflare înainte să ajung la brutărie, bătute de un vânticel tăios și rece venit dinspre parc.</w:t>
+        <w:t xml:space="preserve">Mi-am pus paltonul și am chemat-o pe Pip, care a simțit schimbarea din vocea mea și a venit imediat. Am luat-o amândouă pe Bulevardul Evergreen într-un pas care m-a lăsat fără suflare înainte să ajung la brutărie, bătute de un vânticel tăios și rece venit dinspre parc.</w:t>
       </w:r>
     </w:p>
     <w:p/>
@@ -2011,7 +2011,7 @@
     <w:p/>
     <w:p>
       <w:r>
-        <w:t>Nimeni din cerc nu rostise numele Renéei. Nici eu.</w:t>
+        <w:t xml:space="preserve">Nimeni din cerc nu rostise numele lui Renée. Nici eu.</w:t>
       </w:r>
     </w:p>
     <w:p>
@@ -2288,7 +2288,7 @@
     <w:p/>
     <w:p>
       <w:r>
-        <w:t>Măcelăria lui Pete se afla de cealaltă parte a parcului față de bulevardul Evergreen, în șirul de prăvălii care dădeau spre parc din partea opusă. Am trecut pe poteca deszăpezită pe lângă monumentul eroilor. Carnea lui venea prin curtea din spatele magazinelor de pe Evergreen, aceeași curte cu făina Gretei. Nu mă gândisem cum se cuvine, până n-am stat pe preșul lui, cu clopoțelul încă legănându-se deasupra capului, cum lega acel singur loc necazul lui de al ei. În magazin era cald. Mirosea a carne proaspătă și rece și a rumeguș, iar sub ele se simțea adierea slabă de fier care persista în toate măcelăriile, oricât de frecate ar fi fost. Pete era în spatele vitrinei, în șorțul lui în dungi, cu umerii lați și tâmplele cărunte. Tranșa o bucată de carne cu mișcările scurte și cumpătate ale unui om care o făcuse de patruzeci de mii de ori. A ridicat privirea spre clopoțel, a văzut că eram eu și chipul i s-a umbrit de neîncredere. Avea aerul omului care descoperise de curând că oamenii care îi treceau pragul aveau tendința să-i ceară mereu același lucru.</w:t>
+        <w:t xml:space="preserve">Măcelăria lui Pete se afla de cealaltă parte a parcului față de Bulevardul Evergreen, în șirul de prăvălii care dădeau spre parc din partea opusă. Am trecut pe poteca deszăpezită pe lângă monumentul eroilor. Carnea lui venea prin curtea din spatele magazinelor de pe Evergreen, aceeași curte cu făina Gretei. Nu mă gândisem cum se cuvine, până n-am stat pe preșul lui, cu clopoțelul încă legănându-se deasupra capului, cum lega acel singur loc necazul lui de al ei. În magazin era cald. Mirosea a carne proaspătă și rece și a rumeguș, iar sub ele se simțea adierea slabă de fier care persista în toate măcelăriile, oricât de frecate ar fi fost. Pete era în spatele vitrinei, în șorțul lui în dungi, cu umerii lați și tâmplele cărunte. Tranșa o bucată de carne cu mișcările scurte și cumpătate ale unui om care o făcuse de patruzeci de mii de ori. A ridicat privirea spre clopoțel, a văzut că eram eu și chipul i s-a umbrit de neîncredere. Avea aerul omului care descoperise de curând că oamenii care îi treceau pragul aveau tendința să-i ceară mereu același lucru.</w:t>
       </w:r>
     </w:p>
     <w:p/>
@@ -2551,7 +2551,7 @@
     </w:p>
     <w:p>
       <w:r>
-        <w:t>Chiar așa făcuseră. Nici că exista alt cuvânt mai potrivit. Stăteam în capul bulevardului Evergreen, cu Pip lângă mine, în timp ce tot caldarâmul se umplea de lume. Și până și eu, care cunoșteam mâna ce făcuse asta la fel de bine cum o știam pe a mea, am rămas fără suflare în fața prostiei atât de curate și vesele a gestului.</w:t>
+        <w:t xml:space="preserve">Chiar așa făcuseră. Nici că exista alt cuvânt mai potrivit. Stăteam în capul Bulevardului Evergreen, cu Pip lângă mine, în timp ce tot caldarâmul se umplea de lume. Și până și eu, care cunoșteam mâna ce făcuse asta la fel de bine cum o știam pe a mea, am rămas fără suflare în fața prostiei atât de curate și vesele a gestului.</w:t>
       </w:r>
     </w:p>
     <w:p>
@@ -2806,7 +2806,7 @@
     <w:p/>
     <w:p>
       <w:r>
-        <w:t>Greta și-a recuperat vitrina la trei zile după incidentul cu cărămidă, geamul și literele aurite care formau din nou cuvintele HOLLY JOLLY BAKERY pe fațadă, montate de Tom de la magazinul de feronerie. În aceeași dimineață a deschis ușile și a dat de un asemenea val de clienți încât i-a venit să plângă. Cuptoarele îi funcționau din nou perfect, la fel de ciudat pe cât o luaseră razna. De la faza cu cărămidă, ținuse ușa din spate zăvorâtă în timp ce cocea, fie că era cald în bucătărie sau nu, și fiecare tură ieșise bună, fără urmă de acreală. Stătea în spatele tejghelei reparate, ninsă cu făină și luminată ca un felinar. Vindea biscuiți cu ghimbir unui rând de oameni care ieșea până în stradă și le spunea tuturor, cu voce tare, că nu se îndoise nicio secundă de spiritul sezonului. Era o minciună. Una frumoasă, și toată lumea de pe stradă i-a trecut-o cu vederea.</w:t>
+        <w:t xml:space="preserve">Greta și-a recuperat vitrina la trei zile după incidentul cu cărămidă, geamul și literele aurite care formau din nou cuvintele HOLLY JOLLY BAKERY pe fațadă, montate de Tom de la magazinul de feronerie. În aceeași dimineață a deschis ușile și a dat de un asemenea val de clienți încât i-a venit să plângă. Cuptoarele îi funcționau din nou perfect, la fel de ciudat pe cât o luaseră razna. De la faza cu cărămidă, ținuse ușa din spate zăvorâtă în timp ce cocea, fie că era cald în bucătărie sau nu, și fiecare șarjă ieșise bună, fără urmă de acreală. Stătea în spatele tejghelei reparate, ninsă cu făină și luminată ca un felinar. Vindea biscuiți cu ghimbir unui rând de oameni care ieșea până în stradă și le spunea tuturor, cu voce tare, că nu se îndoise nicio secundă de spiritul sezonului. Era o minciună. Una frumoasă, și toată lumea de pe stradă i-a trecut-o cu vederea.</w:t>
       </w:r>
     </w:p>
     <w:p/>
@@ -2969,7 +2969,7 @@
     </w:p>
     <w:p>
       <w:r>
-        <w:t>— Asta n-a sunat așa. A venit dactilografiată și a menționat subpunctele. Mi-a citat codul exact privind temperatura chiuvetei, capitol și secțiune. A pomenit despre rosturi și despre spațiul de sub ușă folosind termenii de specialitate înainte ca eu să fi pus piciorul înăuntru, de parcă citea dintr-un manual o listă de verificare. A numit camera frigorifică „camera rece”, ca și cum ar fi fost un nume propriu, iar chiuveta de la spălat mâini, „chiuveta Hobart”. Oricine a scris-o știa pentru ce anume e sancționată o bucătărie comercială, o știa ca pe o poezie și știa exact unde are o clădire veche punctele ei slabe.</w:t>
+        <w:t xml:space="preserve">— Asta n-a sunat așa. A venit dactilografiată și a menționat subpunctele. Mi-a citat codul exact privind temperatura chiuvetei, capitol și secțiune. A pomenit despre rosturi și despre spațiul de sub ușă folosind termenii de specialitate înainte ca eu să fi pus piciorul înăuntru, de parcă citea dintr-un manual o listă de verificare. A numit camera frigorifică „camera rece”, ca și cum ar fi fost un nume propriu, iar chiuveta de spălat mâini, „chiuveta Hobart”. Oricine a scris-o știa pentru ce anume e sancționată o bucătărie comercială, o știa ca pe o poezie și știa exact unde are o clădire veche punctele ei slabe.</w:t>
       </w:r>
     </w:p>
     <w:p>
@@ -3078,7 +3078,7 @@
     </w:p>
     <w:p>
       <w:r>
-        <w:t>— Păi, doar nu te închid degeaba, nu? iar cealaltă i-a răspuns: „Nu, presupun că nu.”</w:t>
+        <w:t xml:space="preserve">„Păi, doar nu te închid degeaba, nu?”, iar cealaltă i-a răspuns: „Nu, presupun că nu.”</w:t>
       </w:r>
     </w:p>
     <w:p>
@@ -3434,7 +3434,7 @@
     </w:p>
     <w:p>
       <w:r>
-        <w:t>— N-am spus că n-are nimic. Am spus că n-are nimic făina. A întors borcanul în lumină. Ceva e în ea. Ceva ce nu e făină. E amestecat peste tot, fin și uniform, și tocmai asta îi acrește produsele, pentru că nu face absolut nimic în stare uscată într-un recipient și face totul odată ce se umezește. Amesteci un aluat cu chestia asta prin el și acrește tot lotul, iar cuptorul împinge marginea asta brânzită prin miez și până pe limbă. De aia a urmărit-o prin patru loturi curate și un sac nou de drojdie și n-a prins-o niciodată. Căuta un ingredient stricat. Asta nu e un ingredient stricat. E un adaos.</w:t>
+        <w:t xml:space="preserve">— N-am spus că n-are nimic. Am spus că n-are nimic făina. A întors borcanul în lumină. Ceva e în ea. Ceva ce nu e făină. E amestecat peste tot, fin și uniform, și tocmai asta îi acrește produsele, pentru că nu face absolut nimic în stare uscată într-un recipient și face totul odată ce se umezește. Amesteci un aluat cu chestia asta prin el și acrește toată șarja, iar cuptorul împinge marginea asta brânzită prin miez și până pe limbă. De aia a urmărit-o prin patru șarje curate și un sac nou de drojdie și n-a prins-o niciodată. Căuta un ingredient stricat. Asta nu e un ingredient stricat. E un adaos.</w:t>
       </w:r>
     </w:p>
     <w:p>
@@ -3471,12 +3471,12 @@
     </w:p>
     <w:p>
       <w:r>
-        <w:t>Pentru că se potrivea. Nicio cămară umedă. Niciun ghinion. O pulbere cumpărată cu nume comercial, tăiată în făina ei de o mână care știa doza la miligram, ascunsă în sac și arătându-se abia pe limbă, după coacere. Am stat acolo pe treapta doctorului și am aliniat vechile fapte, ca la Frosty's, doar că acum mai de aproape și mai apăsat.</w:t>
-      </w:r>
-    </w:p>
-    <w:p>
-      <w:r>
-        <w:t>Nu puteai să cumperi o bază acră cu sacul de pe raftul unui băcan. Venea de la un furnizor pentru brutării, pe cont, către persoane cunoscute în domeniu. Nici n-o puteai doza din ochi. Un praf prea puțin dădea greș. O cupă în plus și făina crudă mirosea înțepător în clipa în care se deschidea sacul, iar orice brutar ar fi aruncat punga. Ca s-o ruinezi și să lași făina să pară și să miroasă destul de sănătos încât să o coacă de patru ori, de patru ori prin loturi curate și un sac proaspăt de drojdie în timp ce căuta un defect care nu fusese niciodată în mâinile ei, a necesitat cunoașterea dozei greșite exacte. Asta era o cunoștință de specialitate, nu furia unui vecin. Era din același aluat cu plângerea dactilografiată care cita subpunctele, mâna care știa pe de rost codul pentru chiuveta de spălat mâini. Aceeași pricepere, de două ori acum, în două arme diferite.</w:t>
+        <w:t xml:space="preserve">Pentru că se potrivea. Nicio cămară umedă. Niciun ghinion. O pulbere cumpărată cu nume comercial, amestecată în făina ei de o mână care știa doza la miligram, ascunsă în sac și arătându-se abia pe limbă, după coacere. Am stat acolo pe treapta doctorului și am aliniat vechile fapte, ca la Frosty's, doar că acum mai de aproape și mai apăsat.</w:t>
+      </w:r>
+    </w:p>
+    <w:p>
+      <w:r>
+        <w:t xml:space="preserve">Nu puteai să cumperi o bază acră cu sacul de pe raftul unui băcan. Venea de la un furnizor pentru brutării, pe cont, către persoane cunoscute în domeniu. Nici n-o puteai doza din ochi. Un praf prea puțin dădea greș. O cupă în plus și făina crudă mirosea înțepător în clipa în care se deschidea sacul, iar orice brutar ar fi aruncat punga. Ca s-o ruinezi și să lași făina să pară și să miroasă destul de sănătos încât să o coacă de patru ori, de patru ori prin șarje curate și un sac proaspăt de drojdie în timp ce căuta un defect care nu fusese niciodată în mâinile ei, trebuia să cunoști exact doza greșită. Asta era o cunoștință de specialitate, nu furia unui vecin. Era din același aluat cu plângerea dactilografiată care cita subpunctele, mâna care știa pe de rost codul pentru chiuveta de spălat mâini. Aceeași pricepere, de două ori acum, în două arme diferite.</w:t>
       </w:r>
     </w:p>
     <w:p>
@@ -3611,7 +3611,7 @@
     <w:p/>
     <w:p>
       <w:r>
-        <w:t>Aleea din spatele prăvăliilor de pe Evergreen se întindea pe toată lungimea blocului, o crestătură deszăpezită între spatele prăvăliilor și zidul scund al loturilor din spatele lor. Destul de lată pentru o singură dubă și nimic mai mult. Am coborât-o încet, la lumina plată a dimineții, cu Pip la călcâiul meu, devenită tăcută și prudentă, și am citit spatele prăvăliilor așa cum nu mă ostenisem niciodată s-o fac. Ca pe niște uși, nu ca pe niște pereți. Aici era ușa de oțel a farmaciei, ținută încuiată, cu un clopoțel pe ea. Și aici cele două care împărțeau rampa. Depozitul frigorific al lui Pete, o cameră veche din blocuri de beton cu o încuietoare grea, și al doilea lacăt pe care-l cumpărase de la Tom, lucios și nou, pus pe poartă. Și la trei uși mai încolo, a Gretei, scundă și de lemn, tocită la clanță de la patruzeci de ani de mână plină de făină.</w:t>
+        <w:t xml:space="preserve">Aleea din spatele prăvăliilor de pe Evergreen se întindea pe toată lungimea șirului de prăvălii, o crestătură deszăpezită între spatele prăvăliilor și zidul scund al loturilor din spatele lor. Destul de lată pentru o singură dubă și nimic mai mult. Am coborât-o încet, la lumina plată a dimineții, cu Pip la călcâiul meu, devenită tăcută și prudentă, și am citit spatele prăvăliilor așa cum nu mă ostenisem niciodată s-o fac. Ca pe niște uși, nu ca pe niște pereți. Aici era ușa de oțel a farmaciei, ținută încuiată, cu un clopoțel pe ea. Și aici cele două care împărțeau rampa. Depozitul frigorific al lui Pete, o cameră veche din blocuri de beton cu o încuietoare grea, și al doilea lacăt pe care-l cumpărase de la Tom, lucios și nou, pus pe poartă. Și la trei uși mai încolo, a Gretei, scundă și de lemn, tocită la clanță de la patruzeci de ani de mână plină de făină.</w:t>
       </w:r>
     </w:p>
     <w:p/>
@@ -3737,7 +3737,7 @@
     <w:p/>
     <w:p>
       <w:r>
-        <w:t xml:space="preserve">Jos, la capătul de jos al blocului, o dubă de brutărie sta trasă la bordură în fața prăvăliei Holly Jolly, cu inscripția </w:t>
+        <w:t xml:space="preserve">Jos, la capătul de jos al străzii, o dubă de brutărie sta trasă la bordură în fața prăvăliei Holly Jolly, cu inscripția </w:t>
       </w:r>
       <w:r>
         <w:rPr>
@@ -3776,7 +3776,7 @@
     <w:p/>
     <w:p>
       <w:r>
-        <w:t>Joyce m-a văzut când s-a întors să împingă ușa și a ridicat o mână. I-am făcut și eu semn cu mâna. Pip, care urmărise cum folia prindea lumina tot drumul până la ușă, o luase la fugă pe trotuar după ea, și a trebuit s-o strig de două ori înainte să se întoarcă și să vină.</w:t>
+        <w:t xml:space="preserve">Joyce m-a văzut când s-a întors să împingă ușa și a ridicat o mână. I-am făcut și eu semn cu mâna. Pip, care urmărise cum folia prindea lumina tot drumul până la ușă, a luat-o la fugă pe trotuar după ea, și a trebuit s-o strig de două ori înainte să se întoarcă și să vină.</w:t>
       </w:r>
     </w:p>
     <w:p>
@@ -4613,7 +4613,7 @@
         <w:t>O săptămână. Poate mai mult, dacă piesele pentru chiuvetă nu sosesc.</w:t>
       </w:r>
       <w:r>
-        <w:t xml:space="preserve"> Săptămâna în care autorizația Gretei fusese suspendată până la remedierea neregulilor, când Holly Jolly avea să stea în întuneric, iar întregul ei prim avânt în sezon era retezat din fașă. Singura săptămână din întregul parcurs luminos spre Crăciun în care cea mai veche brutărie de pe Evergreen Avenue avea să se cufunde în întuneric.</w:t>
+        <w:t xml:space="preserve"> Săptămâna în care autorizația Gretei fusese suspendată până la remedierea neregulilor, când Holly Jolly avea să stea în întuneric, iar întregul ei prim avânt în sezon era retezat din fașă. Singura săptămână din întregul parcurs luminos spre Crăciun în care cea mai veche brutărie de pe Bulevardul Evergreen avea să se cufunde în întuneric.</w:t>
       </w:r>
     </w:p>
     <w:p/>
@@ -5313,7 +5313,7 @@
     <w:p/>
     <w:p>
       <w:r>
-        <w:t>— Ați intrat în bucătăria mea, a spus ea, chiar în săptămâna mea de deschidere, însoțită de medicul veterinar al orașului, ca să mă întrebi dacă am sabotat făina unei brutărese de la țară.</w:t>
+        <w:t xml:space="preserve">— Ați intrat în bucătăria mea, a spus ea, chiar în săptămâna mea de deschidere, însoțită de medicul veterinar al orașului, ca să mă întrebați dacă am sabotat făina unei brutărese de la țară.</w:t>
       </w:r>
     </w:p>
     <w:p/>
@@ -5421,7 +5421,7 @@
     <w:p/>
     <w:p>
       <w:r>
-        <w:t xml:space="preserve">— Rosturile? Mi-a spus Joyce Wendt. Obișnuia să coacă în bucătăria aceea. Mi-a povestit și despre loturile stricate ale Gretei, chiar în lunea când au început, înainte ca cineva de pe bulevardul ăsta să știe ceva. E venită încoace și încolo prin bucătăria mea din octombrie cu tot felul de eșantioane, încercând să-mi vândă pâine. Și vorbește despre vechiul magazin al Gretei de parcă încă ar avea cheia. </w:t>
+        <w:t xml:space="preserve">— Rosturile? Mi-a spus Joyce Wendt. Obișnuia să coacă în bucătăria aceea. Mi-a povestit și despre șarjele stricate ale Gretei, chiar în lunea când au început, înainte ca cineva de pe bulevardul ăsta să știe ceva. Tot vine și pleacă din bucătăria mea din octombrie încoace, cu tot felul de mostre, încercând să-mi vândă pâine. Și vorbește despre vechiul magazin al Gretei de parcă încă ar avea cheia. </w:t>
       </w:r>
     </w:p>
     <w:p/>
@@ -5752,7 +5752,7 @@
     </w:p>
     <w:p>
       <w:r>
-        <w:t>Am tras fundul de lemn pentru pâine în mijlocul mesei, și acela a fost șirul de prăvălii din fața noastră, tot bulevardul Evergreen așezat din solnițe. Solnița de sare a venit la capătul de jos pentru Holly Jolly, iar cea de piper la capătul celălalt pentru Sugarplum, și mi-am pus lingura de-a lungul spatelui fundului de lemn pentru alee.</w:t>
+        <w:t xml:space="preserve">Am tras fundul de lemn pentru pâine în mijlocul mesei, și acela a fost șirul de prăvălii din fața noastră, tot Bulevardul Evergreen așezat din solnițe. Solnița de sare a venit la capătul de jos pentru Holly Jolly, iar cea de piper la capătul celălalt pentru Sugarplum, și mi-am pus lingura de-a lungul spatelui fundului de lemn pentru alee.</w:t>
       </w:r>
     </w:p>
     <w:p>
@@ -5767,7 +5767,7 @@
     </w:p>
     <w:p>
       <w:r>
-        <w:t>— A ieșit din zidul ei. Asta e tot ce pot garanta. Am pus un deget pe lingură, acolo unde aleea trecea prin spatele prăvăliilor. Containerul ăla stă deschis într-o alee publică. Fără capac, fără lacăt. Pete trece pe lângă ea. Băieții de la livrări dau cu spatele spre ea. Un copil ar fi putut ridica o cărămidă din ea. I-am văzut molozul pe cărămida aia și i-am citit numele. Întoarce-o pe dos. Dacă ai vrea ca orașul să se uite spre Sugarplum, unde te-ai duce după o cărămidă?</w:t>
+        <w:t xml:space="preserve">— A ieșit din zidul ei. Asta e tot ce pot garanta. Am pus un deget pe lingură, acolo unde aleea trecea prin spatele prăvăliilor. Containerul ăla stă deschis într-o alee publică. Fără capac, fără lacăt. Pete trece pe lângă el. Băieții de la livrări dau cu spatele spre el. Un copil ar fi putut ridica o cărămidă din el. I-am văzut molozul pe cărămida aia și i-am citit numele. Întoarce-o pe dos. Dacă ai vrea ca orașul să se uite spre Sugarplum, unde te-ai duce după o cărămidă?</w:t>
       </w:r>
     </w:p>
     <w:p>
@@ -5807,7 +5807,7 @@
     </w:p>
     <w:p>
       <w:r>
-        <w:t>— Același container. A fost îngrămădit cu cartoanele ei turtite de când s-a instalat. Inscripție aurie pe fiecare în parte. Am trecut pe lângă ea. Am bătut cu degetul în capacul de la zaharniță, acolo unde stătea în spatele piperului. Am văzut o cutie aurie la ușa Gretei și am crezut că era Renée care stătea acolo. Tot ce-mi spune asta e că cutia a fost a ei odată. Fiecare cutie din containerul ăla a fost a ei odată.</w:t>
+        <w:t xml:space="preserve">— Același container. A fost îngrămădit cu cartoanele ei turtite de când s-a instalat. Inscripție aurie pe fiecare în parte. Am trecut pe lângă el. Am bătut cu degetul în capacul de la zaharniță, acolo unde stătea în spatele piperului. Am văzut o cutie aurie la ușa Gretei și am crezut că era Renée care stătea acolo. Tot ce-mi spune asta e că cutia a fost a ei odată. Fiecare cutie din containerul ăla a fost a ei odată.</w:t>
       </w:r>
     </w:p>
     <w:p>
@@ -5842,7 +5842,7 @@
     </w:p>
     <w:p>
       <w:r>
-        <w:t>— N-am dat nicio importanță. Un șofer oprit pentru un pui de somn. Dar Pete știe fiecare camion care intră în curtea aia și a zis că nu e al furnizorului de carne, și n-am auzit al nimănui. Mi-am mutat degetul în sus pe lingură spre piper. Și silueta lui Danny. Subțire și iute, la pragul Gretei înainte să se aprindă cuptoarele, și plecat în sus spre capătul celălalt. Eu am auzit «auriu» și m-am gândit la prăvălia aurie. N-a zis niciodată că a intrat în Sugarplum. A zis capătul celălalt. Am pus magazinul acolo eu însămi.</w:t>
+        <w:t xml:space="preserve">— N-am dat nicio importanță. Un șofer oprit pentru un pui de somn. Dar Pete știe fiecare camion care intră în curtea aia și a zis că nu e al furnizorului de carne, și n-am auzit al nimănui. Mi-am mutat degetul în sus pe lingură spre piper. Și silueta lui Danny. Subțire și iute, la pragul Gretei înainte să se aprindă cuptoarele, și plecat în sus spre capătul celălalt. Eu am auzit „auriu” și m-am gândit la prăvălia aurie. N-a zis niciodată că a intrat în Sugarplum. A zis capătul celălalt. Am pus magazinul acolo eu însămi.</w:t>
       </w:r>
     </w:p>
     <w:p>
@@ -5937,7 +5937,7 @@
     </w:p>
     <w:p>
       <w:r>
-        <w:t>— Asta am crezut. Apoi Doc a trecut prin cămara ei joi și n-a fost nicio bază acră în ea, și ea mi-a spus cine îi tot povestise despre rosturile din bucătăria Gretei. N-am mers mai departe de atât, din moment ce jurasem să nu mai pun chipuri pe nimic în noaptea asta. Așa că am rămas cu hârtia. Un pliant e o dovadă pe tejgheaua cuiva cu mult înainte să fie un pliant pe un panou. Cineva l-a văzut acolo. Cineva a citit săptămâna aia de pe el și a scris o plângere către județ ca să cadă în ea.</w:t>
+        <w:t xml:space="preserve">— Asta am crezut. Apoi Doc a trecut prin cămara ei joi și n-a fost nicio bază acră în ea, și ea mi-a spus cine îi tot povestise despre rosturile din bucătăria Gretei. N-am mers mai departe de atât, din moment ce jurasem să nu mai pun chipuri pe nimic în noaptea asta. Așa că am rămas cu hârtia. Un pliant e un șpalt pe tejgheaua cuiva cu mult înainte să fie un pliant pe un panou. Cineva l-a văzut acolo. Cineva a citit săptămâna aia de pe el și a scris o plângere către județ ca să cadă în ea.</w:t>
       </w:r>
     </w:p>
     <w:p>
@@ -5968,7 +5968,7 @@
     <w:p/>
     <w:p>
       <w:r>
-        <w:t>Olivia lăsa prăvălia Yarn Tales deschisă sâmbătă dimineața, cu ibricul pe foc pentru oricine intra de pe stradă, iar în sâmbăta aceea voiam ibricul mai mult decât lâna. Dormisem abia câteva ore. Gerul ținuse toată noaptea, iar aerul de pe Evergreen Avenue era limpede și nemișcat. Pip a pornit înainte, cu penele umflate de frig.</w:t>
+        <w:t xml:space="preserve">Olivia lăsa prăvălia Yarn Tales deschisă sâmbătă dimineața, cu ibricul pe foc pentru oricine intra de pe stradă, iar în sâmbăta aceea voiam ibricul mai mult decât lâna. Dormisem abia câteva ore. Gerul ținuse toată noaptea, iar aerul de pe Bulevardul Evergreen era limpede și nemișcat. Pip a pornit înainte, cu penele umflate de frig.</w:t>
       </w:r>
     </w:p>
     <w:p/>
@@ -6680,7 +6680,7 @@
     </w:p>
     <w:p>
       <w:r>
-        <w:t>A dat jos borcanul de pe raftul de deasupra mesei de lucru, unde stătuse de joi. A scuturat puțin pe o farfurioară curată cu câteva picături de apă și a pus în el o fâșie proaspătă de hârtie de pH. S-a făcut roșie la fel de repede ca înainte.</w:t>
+        <w:t xml:space="preserve">A dat jos borcanul de pe raftul de deasupra mesei de lucru, unde stătuse de joi. A scuturat puțin pe o farfurioară curată cu câteva picături de apă și a pus în ea o fâșie proaspătă de hârtie de pH. S-a făcut roșie la fel de repede ca înainte.</w:t>
       </w:r>
     </w:p>
     <w:p>
@@ -6805,7 +6805,7 @@
     </w:p>
     <w:p>
       <w:r>
-        <w:t>— Caietul de comenzi al Gretei pentru Ziua Recunoștinței era deschisă pe tejgheaua ei în dimineața în care s-a spart geamul, am spus. Joyce Wendt stătea lângă ea cu ochelarii de citit puși și cu telefonul în mână. Vineri seară, Martha și Ivy au primit fiecare câte un telefon de la o brutărie din Bridgton, care se oferea să le onoreze comenzile pentru Holly Jolly. Până la plăcinte.</w:t>
+        <w:t xml:space="preserve">— Caietul de comenzi al Gretei pentru Ziua Recunoștinței era deschis pe tejgheaua ei în dimineața în care s-a spart geamul, am spus. Joyce Wendt stătea lângă el cu ochelarii de citit puși și cu telefonul în mână. Vineri seară, Martha și Ivy au primit fiecare câte un telefon de la o brutărie din Bridgton, care se oferea să le onoreze comenzile pentru Holly Jolly. Până la plăcinte.</w:t>
       </w:r>
     </w:p>
     <w:p>
@@ -6815,7 +6815,7 @@
     </w:p>
     <w:p>
       <w:r>
-        <w:t>— Plângerea numea camera frigorifică „camera rece”, iar chiuveta de spălat mâini „chiuveta Hobart”. Greta spune că nimeni nu le mai spune așa de la Joyce încoace. Lacătul de la poarta curții n-a fost schimbat niciodată, iar Pete spune că tot cade. Iar acritul s-a oprit în dimineața în care Greta a început să-și zăvorască ușa din spate după incidentul cu cărămida, așa că cine a făcut-o venea pe-acolo. A văzut o dubă pe lângă farmacie înainte de ziuă, cu farurile stinse, nu a furnizorului de carne. Ieri s-a uitat la foaia printată de Claire cu duba celor de la Wendt și a zis: „Asta e”.</w:t>
+        <w:t xml:space="preserve">— Plângerea numea camera frigorifică „camera rece”, iar chiuveta de spălat mâini „chiuveta Hobart”. Greta spune că nimeni nu le mai spune așa de la Joyce încoace. Lacătul de la poarta curții n-a fost schimbat niciodată, iar Pete spune că tot cade. Iar acritul s-a oprit în dimineața în care Greta a început să-și zăvorască ușa din spate după incidentul cu cărămida, așa că cine a făcut-o venea pe-acolo. Pete a văzut o dubă pe lângă farmacie înainte de ziuă, cu farurile stinse, nu a furnizorului de carne. Ieri s-a uitat la foaia printată de Claire cu duba celor de la Wendt și a zis: „Asta e”.</w:t>
       </w:r>
     </w:p>
     <w:p>
@@ -6955,7 +6955,7 @@
     </w:p>
     <w:p>
       <w:r>
-        <w:t>— Nimeni nu stă pe alee în întuneric așteptând s-o vadă întorcându-se cu un sac. Nu trebuie s-o prind asupra faptului. O s-o rog să vină în după-amiaza asta, o să i-o pun în față deschis, și ea va trebui să dea socoteală.</w:t>
+        <w:t xml:space="preserve">— Nimeni nu stă pe alee în întuneric așteptând s-o vadă întorcându-se cu un sac. Nu trebuie s-o prind asupra faptului. O s-o rog să vină în după-amiaza asta, o să i-o pun în față deschis, și va avea ocazia să răspundă.</w:t>
       </w:r>
     </w:p>
     <w:p>
@@ -7299,7 +7299,7 @@
     </w:p>
     <w:p>
       <w:r>
-        <w:t>— Douăzeci și cinci de ani, i-a zis ea Gretei. N-ai schimbat-o niciodată. Doamne, Gret.</w:t>
+        <w:t xml:space="preserve">— Douăzeci și cinci de ani, i-a zis ea Gretei. N-ai schimbat niciodată lacătul. Doamne, Gret.</w:t>
       </w:r>
     </w:p>
     <w:p>
@@ -7374,7 +7374,7 @@
     </w:p>
     <w:p>
       <w:r>
-        <w:t xml:space="preserve">— Dar n-ai făcut-o pentru plăcintă, a zis Greta. Să nu-mi spui că ai făcut-o. Ai sunat-o pe Martha. Mi-ai fi luat Ziua Recunoștinței direct de pe propria mea tejghea, fiecare nume din acel caiet. Ai aruncat o cărămidă prin fereastra mea luată din gunoiul franțuzoaicei ăleia, ca să mă uit în sus pe stradă și s-o învinuiesc pe ea. Gura i se crispase. A trimis o fată încoace cu prăjituri </w:t>
+        <w:t xml:space="preserve">— Dar n-ai făcut-o pentru plăcintă, a zis Greta. Să nu-mi spui că ai făcut-o. Ai sunat-o pe Martha. Mi-ai fi luat Ziua Recunoștinței direct de pe propria mea tejghea, fiecare nume din acel caiet. Mi-ai aruncat prin fereastră o cărămidă luată din gunoiul franțuzoaicei ăleia, ca să mă uit în sus pe stradă și s-o învinuiesc pe ea. Gura i se crispase. A trimis o fată încoace cu prăjituri </w:t>
       </w:r>
       <w:r>
         <w:rPr>
@@ -7457,7 +7457,7 @@
     </w:p>
     <w:p>
       <w:r>
-        <w:t>— O să aveți nevoie de un avocat acum, doamnă Wendt, a zis ea, nu fără o anume blândețe. Este dreptul dumneavoastră și l-aș folosi în locul dumneavoastră. Dar o să fiu limpede în privința asta, ca să nu se confunde nimeni mai târziu. Tot ce am este un registru de la furnizor cu semnătura dumneavoastră pe el, o potrivire făcută de chimist, un registru de stat, un bărbat care vă cunoaște duba și două femei pe care brutăria dumneavoastră le-a sunat cu comenzi dintr-un caiet pe care n-aveați niciun drept să-l citiți. Totul scris negru pe alb. Nimic din toate astea nu cere să recunoașteți ceva. A lăsat stiloul jos. Orice ați regreta în după-amiaza asta, și cred că există ceva, nu schimbă nicio iotă de pe pagină. Vei fi pusă sub acuzare astăzi. Sunați-vă avocatul, veniți înapoi cu el până la șase, și vom face restul lucrurilor în liniște.</w:t>
+        <w:t xml:space="preserve">— O să aveți nevoie de un avocat acum, doamnă Wendt, a zis ea, nu fără o anume blândețe. Este dreptul dumneavoastră și l-aș folosi în locul dumneavoastră. Dar o să fiu limpede în privința asta, ca să nu se confunde nimeni mai târziu. Tot ce am este un registru de la furnizor cu semnătura dumneavoastră pe el, o potrivire făcută de chimist, un registru de stat, un bărbat care vă cunoaște duba și două femei pe care brutăria dumneavoastră le-a sunat cu comenzi dintr-un caiet pe care n-aveați niciun drept să-l citiți. Totul scris negru pe alb. Nimic din toate astea nu cere să recunoașteți ceva. A lăsat stiloul jos. Orice ați regreta în după-amiaza asta, și cred că există ceva, nu schimbă nicio iotă de pe pagină. Veți fi pusă sub acuzare astăzi. Sunați-vă avocatul, veniți înapoi cu el până la șase, și vom face restul lucrurilor în liniște.</w:t>
       </w:r>
     </w:p>
     <w:p>
@@ -7528,7 +7528,7 @@
     <w:p/>
     <w:p>
       <w:r>
-        <w:t>Totul se făcuse în liniște, exact cum spusese că va fi. Fără sală. Fără mulțime. Îi adusese ea însăși borcanul meu cu făină din dulapul încuiat al doctorului, având biletul lui semnat alături, luase declarația lui Danny deoparte, cu blândețe, și notase fiecare pas pe măsură ce avansa.</w:t>
+        <w:t xml:space="preserve">Totul se făcuse în liniște, exact cum spusese că va fi. Fără sală. Fără mulțime. Adusese ea însăși borcanul meu cu făină din dulapul încuiat al doctorului, având biletul lui semnat alături, luase declarația lui Danny deoparte, cu blândețe, și notase fiecare pas pe măsură ce avansa.</w:t>
       </w:r>
     </w:p>
     <w:p/>
@@ -7630,7 +7630,7 @@
     <w:p/>
     <w:p>
       <w:r>
-        <w:t>M-am întors în sus pe Evergreen, trecând pe lângă Holly Jolly. Era tot închisă, avizul galben al județului încă în fereastră până când avea să vină Varney să-l dea jos, dar era lumină în spate și mirosea a patiserie la ușă, deși n-avea încă pe cine să servească. N-am bătut. Suma trebuia adusă de șefă.</w:t>
+        <w:t xml:space="preserve">M-am întors în sus pe Evergreen, trecând pe lângă Holly Jolly. Era tot închisă, avizul galben al județului încă în fereastră până când avea să vină Varney să-l dea jos, dar era lumină în spate și mirosea a copturi la ușă, deși n-avea încă pe cine să servească. N-am bătut. Suma trebuia adusă de șefă.</w:t>
       </w:r>
     </w:p>
     <w:p/>
@@ -7648,7 +7648,7 @@
     <w:p/>
     <w:p>
       <w:r>
-        <w:t>Pip știa deja regula și s-a oprit pe treaptă, sub coronița de brad cu fundă aurie pe care o atârnasem de ușă vineri. Era un răzuitor de cizme din alamă încastrat în piatră, lângă treaptă, și s-a aplecat și a lovit-o cu ciocul, înclinându-și capul s-o audă sunând.</w:t>
+        <w:t xml:space="preserve">Pip știa deja regula și s-a oprit pe treaptă, sub coronița de brad cu fundă aurie pe care o atârnasem de ușă vineri. Era un răzuitor de cizme din alamă încastrat în piatră, lângă treaptă, și s-a aplecat și l-a lovit cu ciocul, înclinându-și capul ca să-l audă sunând.</w:t>
       </w:r>
     </w:p>
     <w:p/>
@@ -8512,7 +8512,7 @@
     <w:p/>
     <w:p>
       <w:r>
-        <w:t>— Ai venit devreme, a spus Greta fără să ridice privirea, împingând tava la loc și închizând cuptorul cu șoldul. Comanda pentru coroane nu e împachetată. Așază-te. Ia ceva. Am scos o pâine cu mirodenii care așteaptă o părere.</w:t>
+        <w:t xml:space="preserve">— Ai venit devreme, a spus Greta fără să ridice privirea, împingând tava la loc și închizând cuptorul cu șoldul. Comanda de coronițe nu e împachetată. Așază-te. Ia ceva. Am scos o pâine cu mirodenii care așteaptă o părere.</w:t>
       </w:r>
     </w:p>
     <w:p/>
@@ -8709,7 +8709,7 @@
     <w:p/>
     <w:p>
       <w:r>
-        <w:t>O lăsasem pe Pip sub scaun cu ultima bucată din sardină, să aibă grijă de ea însăși când termina, și am dus comanda de coroane pe bulevard spre Societate. Cele două treburi erau în aceeași direcție și voiam să văd din nou cutia în noua ei siguranță.</w:t>
+        <w:t xml:space="preserve">O lăsasem pe Pip sub scaun cu ultima bucată din sardină, să aibă grijă de ea însăși când termina, și am dus comanda de coronițe pe bulevard spre Societate. Cele două treburi erau în aceeași direcție și voiam să văd din nou cutia în noua ei siguranță.</w:t>
       </w:r>
     </w:p>
     <w:p/>
@@ -8751,13 +8751,13 @@
     <w:p/>
     <w:p>
       <w:r>
-        <w:t>— Așa e, am spus. Dar o să vrea pește în plus timp de o săptămână din cauza asta, așa că te rog să n-o ajuți să-ți amintească.</w:t>
-      </w:r>
-    </w:p>
-    <w:p/>
-    <w:p>
-      <w:r>
-        <w:t>Mark Redfern a urcat cărarea în urma lor, în pasul lui așezat, cu gulerul ridicat împotriva frigului. Mi-a făcut semn cu mâna. I-am ridicat-o și eu.</w:t>
+        <w:t xml:space="preserve">— Așa e, am spus. Dar o să vrea pește în plus timp de o săptămână din cauza asta, așa că te rog să nu-i amintești.</w:t>
+      </w:r>
+    </w:p>
+    <w:p/>
+    <w:p>
+      <w:r>
+        <w:t xml:space="preserve">Mark Redfern a urcat cărarea în urma lor, în pasul lui așezat, cu gulerul ridicat împotriva frigului. Mi-a făcut semn cu mâna. I-am făcut și eu semn.</w:t>
       </w:r>
     </w:p>
     <w:p/>

</xml_diff>

<commit_message>
Full proofcheck Flour Play Romanian: SIGNIFICANT (62 edits)
Co-Authored-By: Claude Opus 5.5 <noreply@anthropic.com>
Claude-Session: https://claude.ai/code/session_012Cm8JxdqzjuttdUSdkQCUg
</commit_message>
<xml_diff>
--- a/translated/corrected/Flour Play - ASSEMBLED - FORMATTED_Romanian.docx
+++ b/translated/corrected/Flour Play - ASSEMBLED - FORMATTED_Romanian.docx
@@ -614,7 +614,7 @@
     </w:p>
     <w:p>
       <w:r>
-        <w:t xml:space="preserve">— Două tranșe de rulouri. O serie de gogoși înainte de asta, tot ce-a intrat în friteuză. Am dat vina pe uleiul de prăjit la început, așa că l-am schimbat și le-am prăjit din nou. Au ieșit la fel de acre. Și pâinea pentru sandvișuri. </w:t>
+        <w:t xml:space="preserve">— Două șarje de rulouri. O serie de gogoși înainte de asta, tot ce-a intrat în friteuză. Am dat vina pe uleiul de prăjit la început, așa că l-am schimbat și le-am prăjit din nou. Au ieșit la fel de acre. Și pâinea pentru sandvișuri. </w:t>
       </w:r>
     </w:p>
     <w:p>
@@ -659,7 +659,7 @@
     </w:p>
     <w:p>
       <w:r>
-        <w:t xml:space="preserve">— Și acum, când vine Ziua Recunoștinței, nu pot coace o pâine comestibilă. Am verificat totul. Cuptoarele sunt bune, am pus câte un termometru în fiecare. Am deschis un cub nou de drojdie. Am frecat tot locul aseară în caz că a intrat ceva stricat în aer. Și în dimineața asta am amestecat o tranșă curată, atentă ca la un botez, și a ieșit ca asta. </w:t>
+        <w:t xml:space="preserve">— Și acum, când vine Ziua Recunoștinței, nu pot coace o pâine comestibilă. Am verificat totul. Cuptoarele sunt bune, am pus câte un termometru în fiecare. Am deschis un cub nou de drojdie. Am frecat tot locul aseară în caz că a intrat ceva stricat în aer. Și în dimineața asta am amestecat o șarjă curată, atentă ca la un botez, și a ieșit ca asta. </w:t>
       </w:r>
     </w:p>
     <w:p>
@@ -897,7 +897,7 @@
     <w:p/>
     <w:p>
       <w:r>
-        <w:t>Avea poate cincizeci de ani și îi purta cu mândrie. Părul ei închis la culoare era strâns la spate, fără nicio șuviță rebelă, în vântul care suflase părul în ochii tuturor toată dimineața. Hainele îi erau simple și scumpe. Lângă ea, am fost conștientă de făina pe care o luasem probabil de la Greta și am avut sentimentul că ea o observase prima.</w:t>
+        <w:t>Avea poate cincizeci de ani și îi purta cu grație. Părul ei închis la culoare era strâns la spate, fără nicio șuviță rebelă, în vântul care suflase părul în ochii tuturor toată dimineața. Hainele îi erau simple și scumpe. Lângă ea, am fost conștientă de făina pe care o luasem probabil de la Greta și am avut sentimentul că ea o observase prima.</w:t>
       </w:r>
     </w:p>
     <w:p/>
@@ -993,7 +993,7 @@
     <w:p/>
     <w:p>
       <w:r>
-        <w:t>— Nu și pâinea, totuși, a adăugat ea. Pâinea cere pe cineva treaz la două dimineața pentru câțiva dolari pe bucată, iar diminețile mele sunt deja ocupate. Există un brutar en gros tocmai în Bridgton care vrea să-mi vândă pâinea ei. Este foarte entuziasmată. S-ar putea să o las. A râs de ea însăți. Va trebui să mă iertați. Vorbesc întruna despre afaceri. Este singurul lucru pe care îl iubesc la fel de mult ca mâncatul.</w:t>
+        <w:t>— Nu și pâinea, totuși, a adăugat ea. Pâinea cere pe cineva treaz la două dimineața pentru câțiva dolari pe bucată, iar diminețile mele sunt deja ocupate. Există o brutăreasă en gros tocmai în Bridgton care vrea să-mi vândă pâinea ei. Este foarte entuziasmată. S-ar putea să o las. A râs de ea însăți. Va trebui să mă iertați. Vorbesc întruna despre afaceri. Este singurul lucru pe care îl iubesc la fel de mult ca mâncatul.</w:t>
       </w:r>
     </w:p>
     <w:p/>
@@ -1029,7 +1029,7 @@
     <w:p/>
     <w:p>
       <w:r>
-        <w:t>— E fermecătoare, am spus. Cuptoarele sunt foarte fine și ți-am adus o prăjitură franceză ca să dovedesc că am fost acolo. Am pus cutia jos. S-a pregătit la Lyon și a condus o casă mare în Montreal. Știe exact ce face.</w:t>
+        <w:t>— E fermecătoare, am spus. Cuptoarele sunt foarte fine și ți-am adus o prăjitură franceză ca să dovedesc că am fost acolo. Am pus cutia jos. S-a pregătit la Lyon și a condus o cofetărie mare la Montreal. Știe exact ce face.</w:t>
       </w:r>
     </w:p>
     <w:p/>
@@ -1077,7 +1077,7 @@
     <w:p/>
     <w:p>
       <w:r>
-        <w:t>— E doar o idee, a spus el. Dar frigul a venit devreme anul acesta și se spune că va fi o iarnă lungă. Pentru unii oameni din orașul ăsta, o iarnă lungă înseamnă mai mult decât un foc plăcut și o coroană pe ușă. A bătut în hârtie, unde trăsase coloane cu o mână îngrijită: alimente uscate, conserve, lucruri călduroase. O colectă de alimente. Pe parcursul sezonului. Nimic grandios. Un butoi în fața magazinului meu, unul aici dacă îl ține Kelly, și unul la biserică. Oamenii pun ce pot și prin ianuarie, când o să fie mai greu, vom avea ceva pus deoparte pentru oricine are nevoie. A ridicat privirea, din nou timid, un om căruia îi era teamă ca nu cumva ideea lui bună să fie luată drept slăbiciune. Am avut o iarnă grea odată, înainte să am magazinul. Încă îmi amintesc cine a lăsat o cutie pe treptele mele. Aș vrea să fiu asta pentru cineva anul acesta.</w:t>
+        <w:t>— E doar o idee, a spus el. Dar frigul a venit devreme anul acesta și se spune că va fi o iarnă lungă. Pentru unii oameni din orașul ăsta, o iarnă lungă înseamnă mai mult decât un foc plăcut și o coroniță pe ușă. A bătut în hârtie, unde trăsase coloane cu o mână îngrijită: alimente uscate, conserve, lucruri călduroase. O colectă de alimente. Pe parcursul sezonului. Nimic grandios. Un butoi în fața magazinului meu, unul aici dacă îl ține Kelly, și unul la biserică. Oamenii pun ce pot și prin ianuarie, când o să fie mai greu, vom avea ceva pus deoparte pentru oricine are nevoie. A ridicat privirea, din nou timid, un om căruia îi era teamă ca nu cumva ideea lui bună să fie luată drept slăbiciune. Am avut o iarnă grea odată, înainte să am magazinul. Încă îmi amintesc cine a lăsat o cutie pe treptele mele. Aș vrea să fiu asta pentru cineva anul acesta.</w:t>
       </w:r>
     </w:p>
     <w:p/>
@@ -1597,7 +1597,7 @@
     <w:p/>
     <w:p>
       <w:r>
-        <w:t>— Și fereastra, și peretele, a spus Dot, mușcând dintr-o bucată de sârmă cu un sunet scurt și sec. Tom a curățat vopseaua.</w:t>
+        <w:t>— Și fereastra, și peretele, a spus Dot, tăind o bucată de sârmă cu un pocnet scurt și sec. Tom a curățat vopseaua.</w:t>
       </w:r>
     </w:p>
     <w:p/>
@@ -1861,7 +1861,7 @@
     <w:p/>
     <w:p>
       <w:r>
-        <w:t>— Nu depinde de tine, și n-o s-o las eu, a zis Ellie, liniștită, de parcă ar fi vrut ca cineva să-i spună că nu e obligată să ducă povara asta. Am vrut doar să fie rostit cu voce tare ca să fim de acord cu toții că ne e rușine de el.</w:t>
+        <w:t>— N-o să iasă, iar eu n-o să-l las, a zis Ellie, liniștită, de parcă ar fi vrut ca cineva să-i spună că nu e obligată să ducă povara asta. Am vrut doar să fie rostit cu voce tare ca să fim de acord cu toții că ne e rușine de el.</w:t>
       </w:r>
     </w:p>
     <w:p/>
@@ -2178,7 +2178,7 @@
     </w:p>
     <w:p>
       <w:r>
-        <w:t>— Vin s-o vadă, a spus Theo, urmărindu-mi privirea. Oameni care n-au mai călcat pe aici de ani de zile. Intră de pe strada înghețată. Stau în fața cutiei un minut, apoi pleacă. Emma Redfern și-a adus întreaga clasă de elevi, două șiruri ținându-se de frânghie, tăcuți ca în biserică, știind că în ea este închisă o sută de ani care le aparțin. A clătinat din cap. Mi-am petrecut toată viața încercând să aduc oameni în această clădire. Și tocmai o cutie sigilată reușește asta la sfârșit, plus rândurile scrise de o fondatoare pe spatele unui desen vechi. Nu eu.</w:t>
+        <w:t>— Vin s-o vadă, a spus Theo, urmărindu-mi privirea. Oameni care n-au mai călcat pe aici de ani de zile. Intră de pe strada înghețată. Stau în fața cutiei un minut, apoi pleacă. Emma Redfern și-a adus întreaga clasă de elevi, două șiruri ținându-se de frânghie, tăcuți ca în biserică, știind că în ea sunt închiși o sută de ani care le aparțin. A clătinat din cap. Mi-am petrecut toată viața încercând să aduc oameni în această clădire. Și tocmai o cutie sigilată reușește asta la sfârșit, plus rândurile scrise de o fondatoare pe spatele unui desen vechi. Nu eu.</w:t>
       </w:r>
     </w:p>
     <w:p>
@@ -2251,7 +2251,7 @@
     </w:p>
     <w:p>
       <w:r>
-        <w:t>— Construiește butoiul, am spus eu. Am să coc pentru el și am să-l târăsc pe Nick să-l care. Și pun pariu că și Greta o să coacă pentru ea în ziua în care îi vor reveni cuptoarele, pentru că nu există niciun suflet pe această stradă care să-i fi ținut numele în fereastră prin toate astea și să n-o aibă pe a ei drept răspuns. Am împăturit hârtia lui drept pe linia îndoiturii, exact cum îi plăcea, și i-am înapoiat-o. Societatea este încă în mare impas, Hal. Să nu te lași înșelat de sentimentul de bine. Vorbele unei fondatoare n-or să repare o centrală.</w:t>
+        <w:t>— Construiește butoiul, am spus eu. Am să coc pentru el și am să-l târăsc pe Nick să-l care. Și pun pariu că și Greta o să coacă pentru el în ziua în care îi vor reveni cuptoarele, pentru că nu există niciun suflet pe această stradă care să-i fi ținut numele în fereastră prin toate astea și să n-o aibă pe a ei drept răspuns. Am împăturit hârtia lui drept pe linia îndoiturii, exact cum îi plăcea, și i-am înapoiat-o. Societatea este încă în mare impas, Hal. Să nu te lași înșelat de sentimentul de bine. Vorbele unei fondatoare n-or să repare o centrală.</w:t>
       </w:r>
     </w:p>
     <w:p>
@@ -2342,13 +2342,13 @@
     <w:p/>
     <w:p>
       <w:r>
-        <w:t>— Da, în fine. A tras un ochi strâns. Și toată strada a decis a cui ușă s-o încarce. E aia de vizavi de parc, cu numele meu deasupra. A spus-o pe un ton plat, cu amărăciunea ieșită la iveală pe chipul lui, lezat și sonor, o durere pe care ar fi purtat-o la amiază drept pe mijlocul bulevardului decât s-o ascundă. Haideți, spuneți. Ați auzit-o. Pete Garcia și rampa de încărcare, lanțul de la poartă, pus pe harță cu ea din vară. Atunci cine altcineva?</w:t>
-      </w:r>
-    </w:p>
-    <w:p/>
-    <w:p>
-      <w:r>
-        <w:t>— Am auzit-o pomenită, am spus, cu grijă și pe bună dreptate. N-am auzit să fi dat vreo adeziune.</w:t>
+        <w:t>— Da, în fine. A tras un ochi strâns. Și toată strada a decis la ușa cui s-o lase. E aia de vizavi de parc, cu numele meu deasupra. A spus-o pe un ton plat, cu amărăciunea ieșită la iveală pe chipul lui, lezat și sonor, o durere pe care ar fi purtat-o la amiază drept pe mijlocul bulevardului decât s-o ascundă. Haideți, spuneți. Ați auzit-o. Pete Garcia și rampa de încărcare, lanțul de la poartă, pus pe harță cu ea din vară. Atunci cine altcineva?</w:t>
+      </w:r>
+    </w:p>
+    <w:p/>
+    <w:p>
+      <w:r>
+        <w:t>— Am auzit-o pomenită, am spus, cu grijă și pe bună dreptate. Nu m-am auzit însă și pe mine fiind de acord.</w:t>
       </w:r>
     </w:p>
     <w:p/>
@@ -2384,7 +2384,7 @@
     <w:p/>
     <w:p>
       <w:r>
-        <w:t>— Bineînțeles că am. Lacătul ei se tot desprinde de pe poarta comună. Nu-mi las depozitul descuiat doar pentru că ea nu se sinchisește să pună o copcă decentă. Așa că da, am cumpărat al doilea de la Tom și o să iau și al treilea dacă trebuie. A mușcat din sfoară. Și am fost pe acolo înainte să se lumineze de ziuă în majoritatea dimineților în ultimele câteva săptămâni. Îți scutesc osteneala de a găsi asta sinistră. Livrările mele vin înainte de revărsatul zorilor. Au venit întotdeauna. Furnizorul de carne își face ruta dis-de-dimineață ca să ne aprovizioneze înainte de deschidere. Sunt în curtea aia luând o carcasă din camionul lui de trei, patru dimineți pe săptămână, la fel ca de douăzeci de ani încoace. Numai că acum cineva a aruncat o cărămidă în geamul Gretei. Omul care e mereu afară, în spate, înainte de ziuă e un mister despre care merită să se șoptească.</w:t>
+        <w:t>— Bineînțeles că am. Lacătul ei se tot desprinde de pe poarta comună. Nu-mi las depozitul descuiat doar pentru că ea nu se sinchisește să pună o copcă decentă. Așa că da, am cumpărat al doilea de la Tom și o să iau și al treilea dacă trebuie. A rupt sfoara cu dinții. Și am fost pe acolo înainte să se lumineze de ziuă în majoritatea dimineților în ultimele câteva săptămâni. Vă scutesc de osteneala de a găsi asta sinistră. Livrările mele vin înainte de revărsatul zorilor. Au venit întotdeauna. Furnizorul de carne își face ruta dis-de-dimineață ca să ne aprovizioneze înainte de deschidere. Sunt în curtea aia luând o carcasă din camionul lui de trei, patru dimineți pe săptămână, la fel ca de douăzeci de ani încoace. Numai că acum cineva a aruncat o cărămidă în geamul Gretei. Omul care e mereu afară, în spate, înainte de ziuă e un mister despre care merită să se șoptească.</w:t>
       </w:r>
     </w:p>
     <w:p/>
@@ -2435,7 +2435,7 @@
         <w:t>sigur, Pete, știm că ai fost pe acolo, despre asta cam e vorba</w:t>
       </w:r>
       <w:r>
-        <w:t>. Când ești sub o umbră, nu vrea nimeni să audă ce ai văzut. A împins friptura mai încolo, cu sfoara arătoasă, hârtia împăturită la linie. Așa că nu. N-am spus nimănui. Vă spun dumneavoastră fiindcă ați venit după o friptură și nu după pielea mea. Orice i s-ar face femeii aceia, n-am făcut-o eu, și mi-e scârbă de moarte că jumătate de stradă încă crede că am făcut-o. Dacă dumneavoastră sunteți cea care umblă cu ochii-n patru, iată ce-a văzut ochiul meu deschis. Fă ce vrei cu asta.</w:t>
+        <w:t>. Când ești sub o umbră, nu vrea nimeni să audă ce ai văzut. A împins friptura mai încolo, cu sfoara arătoasă, hârtia împăturită la linie. Așa că nu. N-am spus nimănui. Vă spun dumneavoastră fiindcă ați venit după o friptură și nu după pielea mea. Orice i s-ar face femeii aceia, n-am făcut-o eu, și mi-e scârbă de moarte că jumătate de stradă încă crede că am făcut-o. Dacă dumneavoastră sunteți cea care umblă cu ochii-n patru, iată ce-a văzut ochiul meu deschis. Faceți ce vreți cu asta.</w:t>
       </w:r>
     </w:p>
     <w:p/>
@@ -2626,7 +2626,7 @@
     </w:p>
     <w:p>
       <w:r>
-        <w:t>Dincolo de farmacie, unde mulțimea se risipise cu totul, un om de zăpadă stătea deoparte, singur. Nu se dusese deloc în parc. O luase în cealaltă direcție, spre prăvăliile de la marginea orașului, cu spatele la ulița spre care se înclinau toți ceilalți, cu chipul lui greoi întors spre gura aleii care trecea prin spatele lor. Mersese vreo trei metri buni departe de tovărășia tuturor celorlalți, și nu era nicio urmă de pași sub el. Stătea singur în frig, cu ochii lui de cărbune ațintiți spre spărtura întunecată dintre clădiri.</w:t>
+        <w:t>Dincolo de farmacie, unde mulțimea se risipise cu totul, un om de zăpadă stătea deoparte, singur. Nu se dusese deloc în parc. O luase în cealaltă direcție, spre prăvăliile din capătul celălalt al bulevardului, cu spatele la ulița spre care se înclinau toți ceilalți, cu chipul lui greoi întors spre gura aleii care trecea prin spatele lor. Mersese vreo trei metri buni departe de tovărășia tuturor celorlalți, și nu era nicio urmă de pași sub el. Stătea singur în frig, cu ochii lui de cărbune ațintiți spre spărtura întunecată dintre clădiri.</w:t>
       </w:r>
     </w:p>
     <w:p>
@@ -2713,7 +2713,7 @@
     </w:p>
     <w:p>
       <w:r>
-        <w:t xml:space="preserve">Nick și-a așezat mâna lui mare pe pietre, duios și cu băgare de seamă, ca un om care atinge lucrul căruia i s-a dăruit cu tot trupul. </w:t>
+        <w:t xml:space="preserve">Nick și-a așezat mâna lui mare pe pietre, duios și cu băgare de seamă, ca un om care atinge lucrul căruia i se dăruise cu totul. </w:t>
       </w:r>
     </w:p>
     <w:p>
@@ -2806,7 +2806,7 @@
     <w:p/>
     <w:p>
       <w:r>
-        <w:t xml:space="preserve">Greta și-a recuperat vitrina la trei zile după incidentul cu cărămidă, geamul și literele aurite care formau din nou cuvintele HOLLY JOLLY BAKERY pe fațadă, montate de Tom de la magazinul de feronerie. În aceeași dimineață a deschis ușile și a dat de un asemenea val de clienți încât i-a venit să plângă. Cuptoarele îi funcționau din nou perfect, la fel de ciudat pe cât o luaseră razna. De la faza cu cărămidă, ținuse ușa din spate zăvorâtă în timp ce cocea, fie că era cald în bucătărie sau nu, și fiecare șarjă ieșise bună, fără urmă de acreală. Stătea în spatele tejghelei reparate, ninsă cu făină și luminată ca un felinar. Vindea biscuiți cu ghimbir unui rând de oameni care ieșea până în stradă și le spunea tuturor, cu voce tare, că nu se îndoise nicio secundă de spiritul sezonului. Era o minciună. Una frumoasă, și toată lumea de pe stradă i-a trecut-o cu vederea.</w:t>
+        <w:t xml:space="preserve">Greta și-a recuperat vitrina la trei zile după incidentul cu cărămidă, geamul și literele aurite care formau din nou cuvintele HOLLY JOLLY BAKERY pe fațadă, montate de Tom de la magazinul de feronerie. În aceeași dimineață a deschis ușile și a dat de un asemenea val de clienți încât i-a venit să plângă. Cuptoarele îi funcționau din nou perfect, la fel de ciudat pe cât o luaseră razna. De la faza cu cărămidă, ținuse ușa din spate zăvorâtă în timp ce cocea, fie că era cald în bucătărie sau nu, și fiecare șarjă ieșise bună, fără urmă de acreală. Stătea în spatele tejghelei reparate, ninsă cu făină și luminată ca un felinar. Vindea biscuiți cu ghimbir unui rând de oameni care ieșea până în stradă și le spunea tuturor, cu voce tare, că nu se îndoise nicio secundă de sezonul ei. Era o minciună. Una frumoasă, și toată lumea de pe stradă i-a trecut-o cu vederea.</w:t>
       </w:r>
     </w:p>
     <w:p/>
@@ -2969,7 +2969,7 @@
     </w:p>
     <w:p>
       <w:r>
-        <w:t xml:space="preserve">— Asta n-a sunat așa. A venit dactilografiată și a menționat subpunctele. Mi-a citat codul exact privind temperatura chiuvetei, capitol și secțiune. A pomenit despre rosturi și despre spațiul de sub ușă folosind termenii de specialitate înainte ca eu să fi pus piciorul înăuntru, de parcă citea dintr-un manual o listă de verificare. A numit camera frigorifică „camera rece”, ca și cum ar fi fost un nume propriu, iar chiuveta de spălat mâini, „chiuveta Hobart”. Oricine a scris-o știa pentru ce anume e sancționată o bucătărie comercială, o știa ca pe o poezie și știa exact unde are o clădire veche punctele ei slabe.</w:t>
+        <w:t xml:space="preserve">— Asta n-a sunat așa. A venit dactilografiată și a menționat subpunctele. Mi-a citat codul exact privind temperatura apei la chiuveta de spălat mâini, capitol și secțiune. A pomenit despre rosturi și despre spațiul de sub ușă folosind termenii de specialitate înainte ca eu să fi pus piciorul înăuntru, de parcă citea dintr-un manual o listă de verificare. A numit camera frigorifică „camera rece”, ca și cum ar fi fost un nume propriu, iar chiuveta de spălat mâini, „chiuveta Hobart”. Oricine a scris-o știa pentru ce anume e sancționată o bucătărie comercială, o știa ca pe o poezie și știa exact unde are o clădire veche punctele ei slabe.</w:t>
       </w:r>
     </w:p>
     <w:p>
@@ -3003,7 +3003,7 @@
         <w:t>A menționat subpunctele.</w:t>
       </w:r>
       <w:r>
-        <w:t xml:space="preserve"> Nu un vecin nebun. Nu un client mofturos. Nu un copil plictisit cu un spray de vopsea care ar fi scris MURDAR pe un perete doar pentru că MURDAR era tot ce știa să spună. Asta era o mână care cunoștea codul exact pentru temperatura chiuvetei și termenul tehnic pentru fanta de sub o ușă. O mână care citise vechea și cinstita bucătărie a Gretei de pe o listă de verificare fără să pună piciorul în ea, și care știa exact unde se subția o clădire veche de o sută de ani. Asta nu era știința cuiva care doar mănâncă pâine. Era știința cuiva care o coace.</w:t>
+        <w:t xml:space="preserve"> Nu un vecin nebun. Nu un client mofturos. Nu un copil plictisit cu un spray de vopsea care ar fi scris MURDAR pe un perete doar pentru că MURDAR era tot ce știa să spună. Asta era o mână care cunoștea codul exact pentru temperatura apei la chiuveta de spălat mâini și termenul tehnic pentru fanta de sub o ușă. O mână care citise vechea și cinstita bucătărie a Gretei de pe o listă de verificare fără să pună piciorul în ea, și care știa exact unde se subția o clădire veche de o sută de ani. Asta nu era știința cuiva care doar mănâncă pâine. Era știința cuiva care o coace.</w:t>
       </w:r>
     </w:p>
     <w:p>
@@ -3191,7 +3191,7 @@
     <w:p/>
     <w:p>
       <w:r>
-        <w:t>— Sunt doamna Claus, am spus. Hal m-a trimis cu făina pe care i-o datorez, și n-a vrut să mă lase să plec fără restul, și e grea, și sunt bătrână, așa că mi-ai face un bine luând-o din brațe înainte să-mi scap ceaiul în zăpadă.</w:t>
+        <w:t>— Sunt doamna Claus, am spus. Hal m-a trimis cu făina pe care i-o datorez, și n-a vrut să mă lase să plec fără restul, și e grea, și sunt bătrână, așa că mi-ai face un bine luând-o din brațe înainte să vă scap ceaiul în zăpadă.</w:t>
       </w:r>
     </w:p>
     <w:p/>
@@ -3263,7 +3263,7 @@
     <w:p/>
     <w:p>
       <w:r>
-        <w:t>Dar cărămida și vopseaua erau partea zgomotoasă, iar partea zgomotoasă era cea mai neînsemnată. Dedesubt stătea făina. Dacă cineva umblase la ea, mă îndoiam că venise dintr-o cămară. Stricase trei rânduri de aluat la fel și continuase să strice după ce Greta își spălase bucătăria și deschisese drojdie nouă. Cine a făcut asta a trebuit să se priceapă: ce să folosească, cât anume și cum să ajungă la o ladă aflată în spatele unei uși încuiate. Un Marc Doucette disperat ar fi fost zgomotos și stângaci. Ar fi luat ce avea la îndemână. N-ar fi dus o campanie metodică și prudentă împotriva unei brutării. Ar fi fost prea ocupat să îi fie foame.</w:t>
+        <w:t>Dar cărămida și vopseaua erau partea zgomotoasă, iar partea zgomotoasă era cea mai neînsemnată. Dedesubt stătea făina. Dacă cineva umblase la ea, mă îndoiam că venise dintr-o cămară. Stricase trei aluaturi diferite în același fel și continuase să strice după ce Greta își spălase bucătăria și deschisese drojdie nouă. Cine a făcut asta a trebuit să se priceapă: ce să folosească, cât anume și cum să ajungă la o ladă aflată în spatele unei uși încuiate. Un Marc Doucette disperat ar fi fost zgomotos și stângaci. Ar fi luat ce avea la îndemână. N-ar fi dus o campanie metodică și prudentă împotriva unei brutării. Ar fi fost prea ocupat să îi fie foame.</w:t>
       </w:r>
     </w:p>
     <w:p/>
@@ -3629,7 +3629,7 @@
     <w:p/>
     <w:p>
       <w:r>
-        <w:t>— Deci, am zis eu încet, către Pip. Nici încuiată. Nici supravegheată. Deschisă în bătaia vântului cu spatele la ea, în fiecare dimineață întunecată până la cărămidă. Oricine avea ce căuta pe aleea asta înainte de zori ar fi putut sta chiar aici.</w:t>
+        <w:t>— Deci, am zis eu încet, către Pip. Nici încuiată. Nici supravegheată. Deschisă în bătaia vântului, cu Greta întoarsă cu spatele la ea, în fiecare dimineață întunecată până la cărămidă. Oricine avea ce căuta pe aleea asta înainte de zori ar fi putut sta chiar aici.</w:t>
       </w:r>
     </w:p>
     <w:p/>
@@ -3931,7 +3931,7 @@
     <w:p/>
     <w:p>
       <w:r>
-        <w:t>— Și ați urmărit-o, am spus. Diminețile acelea. N-ați doar văzut-o.</w:t>
+        <w:t>— Și ați urmărit-o, am spus. Diminețile acelea. Nu v-ați mulțumit doar s-o vedeți.</w:t>
       </w:r>
     </w:p>
     <w:p/>
@@ -4188,7 +4188,7 @@
     <w:p/>
     <w:p>
       <w:r>
-        <w:t>— Danny al tău n-a vopsit zidul acela, doamnă Ott. A stat treaz cu surorile lui în noaptea în care a fost făcut, și o voi spune oricui va întreba.</w:t>
+        <w:t>— Danny al dumneavoastră n-a vopsit zidul acela, doamnă Ott. A stat treaz cu surorile lui în noaptea în care a fost făcut, și o voi spune oricui va întreba.</w:t>
       </w:r>
     </w:p>
     <w:p/>
@@ -4236,7 +4236,7 @@
     <w:p/>
     <w:p>
       <w:r>
-        <w:t>— N-a fost el, am spus. A fost acasă toată noaptea având grijă de surorile lui, iar cei din familia Petersen le-au ținut pe fete în singura oră în care el a ieșit după sirop de tuse. Mama lui o să recunoască, și la fel și ei.</w:t>
+        <w:t>— N-a fost el, am spus. A fost acasă toată noaptea având grijă de surorile lui, iar cei din familia Petersen le-au ținut pe fete în singura oră în care el a ieșit după sirop de tuse. Mama lui o să confirme, și la fel și ei.</w:t>
       </w:r>
     </w:p>
     <w:p/>
@@ -4538,7 +4538,7 @@
     <w:p/>
     <w:p>
       <w:r>
-        <w:t>Vechea cutie a rămas unde era, sigilată sub cartonașul ei în camera din față a Societății până la ceasul ei. Toată lumea trăsese în mintea lor o linie clară între cele două, fără ca vreun suflet să fie nevoit s-o spună cu voce tare. Cea veche trebuia deschisă de an nou, în adunare, așa cum intenționaseră înaintașii. Cea nouă trebuia umplută acum, de mâini vii, și îngropată nedeschisă încă o sută de ani. Una la care așteptai. Una căreia îi adăugai. Privindu-mi vecinii cum își așezau micile comori în noua capsulă, în timp ce butoaiele cu conserve și pâine treceau spre casele de pe deal, m-am gândit că nu văzusem niciodată Frost Falls mai pe deplin sine însuși.</w:t>
+        <w:t>Vechea cutie a rămas unde era, sigilată sub cartonașul ei în camera din față a Societății până la ceasul ei. Toată lumea trăsese în mintea lor o linie clară între cele două, fără ca vreun suflet să fie nevoit s-o spună cu voce tare. Cea veche trebuia deschisă la noul an, în obște, așa cum intenționaseră strămoșii. Cea nouă trebuia umplută acum, de mâini vii, și îngropată nedeschisă încă o sută de ani. Una la care așteptai. Una căreia îi adăugai. Privindu-mi vecinii cum își așezau micile comori în noua capsulă, în timp ce butoaiele cu conserve și pâine treceau spre casele de pe deal, m-am gândit că nu văzusem niciodată Frost Falls mai pe deplin sine însuși.</w:t>
       </w:r>
     </w:p>
     <w:p/>
@@ -4550,7 +4550,7 @@
     <w:p/>
     <w:p>
       <w:r>
-        <w:t>— O să fie de ajuns, a spus el în șoaptă, abia îndrăznind să creadă cuvintele. Societatea. Nimeni n-a cerut un dolar și promisiunile de donații oricum vin. Bătrânul Ferris, pensionat de la uzină, zice că va suporta toată centrala termică dacă orașul face acoperișul. O să salveze locul, Jessica. Cu propriile lor mâini. N-am crezut că voi apuca ziua să-i văd dorindu-și asta atât de tare.</w:t>
+        <w:t>— O să fie de ajuns, a spus el în șoaptă, abia îndrăznind să creadă cuvintele. Societatea. Nimeni n-a cerut un dolar și promisiunile de donații oricum vin. Bătrânul Ferris, pensionat de la fabrică, zice că va suporta toată centrala termică dacă orașul face acoperișul. O să salveze locul, Jessica. Cu propriile lor mâini. N-am crezut că voi apuca ziua să-i văd dorindu-și asta atât de tare.</w:t>
       </w:r>
     </w:p>
     <w:p/>
@@ -4625,7 +4625,7 @@
     <w:p/>
     <w:p>
       <w:r>
-        <w:t>Nu cu o săptămână înainte, ca să-și facă o clientelă înainte de aglomerație. Nu cu o săptămână după, când vadul se așezase. Exact săptămâna aia. Singura săptămână întunecată din anul Gretei, când întregul comerț cu dulciuri de Crăciun al orașului n-ar mai fi avut unde să se ducă, iar acolo, la celălalt capăt al bulevardului, o cofetărie nouă și lucioasă, cu ușile luminate în aur deschise larg ca să prindă fiecare suflet din ele. Tipărită, prinsă în ace și plătită cu o săptămână întreagă înainte ca omul de la județ să calce vreodată în bucătăria Gretei.</w:t>
+        <w:t>Nu cu o săptămână înainte, ca să-și facă o clientelă înainte de aglomerație. Nu cu o săptămână după, când vadul se așezase. Exact săptămâna aia. Singura săptămână întunecată din anul Gretei, când întregul comerț cu dulciuri de Crăciun al orașului n-ar mai fi avut unde să se ducă, iar acolo, la celălalt capăt al bulevardului, o patiserie nouă și lucioasă, cu ușile luminate în aur deschise larg ca să prindă fiecare suflet din el. Totul tipărit, prins în ace și plătit cu o săptămână întreagă înainte ca omul de la județ să calce vreodată în bucătăria Gretei.</w:t>
       </w:r>
     </w:p>
     <w:p/>
@@ -4718,7 +4718,7 @@
     <w:p/>
     <w:p>
       <w:r>
-        <w:t xml:space="preserve">Motivul fusese în fața mea încă din prima zi, într-o femeie învelită în unt ars, care spunea </w:t>
+        <w:t xml:space="preserve">Motivul fusese în fața mea încă din prima zi, într-o femeie învelită în unt brun, care spunea </w:t>
       </w:r>
       <w:r>
         <w:rPr>
@@ -4798,7 +4798,7 @@
     <w:p/>
     <w:p>
       <w:r>
-        <w:t>Mă hotărâsem asupra coroniței în întuneric, în timp ce Nick dormea, singurul pretext care avea să mă treacă pragul ușii ei aurii fără nicio notă falsă, pentru că nu era fals. Femeile din cerc împodobeau tot bulevardul pentru sezon, fiecare ușă de magazin de pe ea, iar un magazin nou însemna o ușă nouă. Să nu-i oferi lui Sugarplum o coroniță în săptămâna în care s-a deschis ar fi fost un gest bătător la ochi. Așa că, în timp ce mâinile mele lucrau cu bradul, aveam să fac și celălalt lucru pentru care venisem. S-o studiez îndeaproape. Destul de aproape ca să prind ce se ascundea sub farmec. Făcusem la fel și cu Pete, lângă butucul lui de măcelar.</w:t>
+        <w:t>Mă hotărâsem asupra coroniței în întuneric, în timp ce Nick dormea, singurul pretext care avea să mă treacă pragul ușii ei aurii fără nicio notă falsă, pentru că nu era fals. Femeile din cerc împodobeau tot bulevardul pentru sezon, fiecare ușă de magazin de pe el, iar un magazin nou însemna o ușă nouă. Să nu-i oferi lui Sugarplum o coroniță în săptămâna în care s-a deschis ar fi fost un gest bătător la ochi. Așa că, în timp ce mâinile mele lucrau cu bradul, aveam să fac și celălalt lucru pentru care venisem. S-o studiez îndeaproape. Destul de aproape ca să prind ce se ascundea sub farmec. Făcusem la fel și cu Pete, lângă butucul lui de măcelar.</w:t>
       </w:r>
     </w:p>
     <w:p/>
@@ -4936,7 +4936,7 @@
     <w:p/>
     <w:p>
       <w:r>
-        <w:t>— Din cetină de balsam și cu o fundă aurie, dacă ați fi atât de amabilă. M-a condus până la ușă, plină de amabilitate până în ultima clipă. Să stea printre celelalte. De parcă aș fi fost aici dintotdeauna. Iată că o zisese din nou. Și o licărire pe sub cuvintele astea în timp ce vorbea. De proprietar. O femeie care își privea bulevardul cu ochii la o afacere pe care o și trecuse în contul ei. Apoi a dispărut, ascunsă la loc sub căldură, și n-a mai fost decât o gazdă care își conducea o veche vecină.</w:t>
+        <w:t>— Din cetină de brad și cu o fundă aurie, dacă ați fi atât de amabilă. M-a condus până la ușă, plină de amabilitate până în ultima clipă. Să stea printre celelalte. De parcă aș fi fost aici dintotdeauna. Iată că o zisese din nou. Și o licărire pe sub cuvintele astea în timp ce vorbea. De proprietar. O femeie care își privea bulevardul cu ochii la o afacere pe care o și trecuse în contul ei. Apoi a dispărut, ascunsă la loc sub căldură, și n-a mai fost decât o gazdă care își conducea o veche vecină.</w:t>
       </w:r>
     </w:p>
     <w:p/>
@@ -4966,7 +4966,7 @@
     <w:p/>
     <w:p>
       <w:r>
-        <w:t>Acasă, am adus cetina de balsam din șopron și am pus cercul pe masa din bucătărie. Pip și-a lăsat căpăcelul de sticlă pe pervaz și l-a sucit de două ori până s-a așezat așa cum îi plăcea. Am tăiat o bucată de panglică aurie pentru funda lui Renée și am pus-o deoparte, am legat primul mănunchi de cetină de balsam de cerc pentru ușa Sugarplum și am strâns sârma cu putere.</w:t>
+        <w:t>Acasă, am adus cetina de brad din șopron și am pus cercul pe masa din bucătărie. Pip și-a lăsat căpăcelul de sticlă pe pervaz și l-a sucit de două ori până s-a așezat așa cum îi plăcea. Am tăiat o bucată de panglică aurie pentru funda lui Renée și am pus-o deoparte, am legat primul mănunchi de cetină de brad de cerc pentru ușa Sugarplum și am strâns sârma cu putere.</w:t>
       </w:r>
     </w:p>
     <w:p>
@@ -5265,7 +5265,7 @@
     <w:p/>
     <w:p>
       <w:r>
-        <w:t>Pip s-a oprit pe treapta măturată a cofetăriei Sugarplum, unde a așteptat și în dimineața aceea, dar și în prima zi, respectând regula lui Renée. Doctorul a stat lângă ea o clipă, bătându-și zăpada de pe ghete, iar ea a apucat capul șiretului său cu ciocul și l-a desfăcut încet. El s-a uitat în jos la ea și l-a lăsat așa.</w:t>
+        <w:t>Pip s-a oprit pe treapta măturată de la Sugarplum, unde așteptase și în dimineața aceea, dar și în prima zi, respectând regula lui Renée. Doctorul a stat lângă ea o clipă, bătându-și zăpada de pe ghete, iar ea a apucat capul șiretului său cu ciocul și l-a desfăcut încet. El s-a uitat în jos la ea și l-a lăsat așa.</w:t>
       </w:r>
     </w:p>
     <w:p/>
@@ -5630,7 +5630,7 @@
     </w:p>
     <w:p>
       <w:r>
-        <w:t>Nu plecase acasă. Doamna Pelletier din consiliu rămăsese să stea cu el, așa cum cereau termenii revenirii lui, și adormise în palton într-un scaun din camera din față, cu cheile în poală. Theo avea o lanternă de tabără pusă pe o ladă și un reșou cu kerosen care își ticăia mica lui căldură portocalie într-un colț, împrumutat sau cumpărat, n-am întrebat. Era în genunchi pe podeaua udă, cu rafturile distruse jumătate golite în jurul lui. Ridicând cutiile îmbibate una câte una. Luând fiecare dosar din fiecare cutie, așezând foile ude una câte una pe fiecare suprafață uscată rămasă în clădirea rece. Mesele lungi. Pervazurile. Sfoară întinsă din colț în colț, cu paginile prinse de ea ca rufele unui sărac. Hârtie sugativă între cele mai afectate, câte o foaie, schimbată și iar schimbată pe măsură ce trăgea apa. Era aceeași muncă lentă pe care o văzusem făcând-o cu cuiele lui, doar că acum avea o singură noapte la dispoziție pentru a o face. Noaptea era foarte rece. Și o făcea în palton, cu respirația vizibilă și fără ca cineva treaz să-l vadă.</w:t>
+        <w:t>Nu plecase acasă. Doamna Pelletier din consiliu rămăsese să stea cu el, așa cum cereau termenii revenirii lui, și adormise în palton într-un scaun din camera din față, cu cheile în poală. Theo avea o lanternă de tabără pusă pe o ladă și o sobiță cu kerosen care își ticăia mica ei căldură portocalie într-un colț, împrumutată sau cumpărată, n-am întrebat. Era în genunchi pe podeaua udă, cu rafturile distruse jumătate golite în jurul lui. Ridicând cutiile îmbibate una câte una. Luând fiecare dosar din fiecare cutie, așezând foile ude una câte una pe fiecare suprafață uscată rămasă în clădirea rece. Mesele lungi. Pervazurile. Sfoară întinsă din colț în colț, cu paginile prinse de ea ca rufele unui sărac. Hârtie sugativă între cele mai afectate, câte o foaie, schimbată și iar schimbată pe măsură ce trăgea apa. Era aceeași muncă lentă pe care o văzusem făcând-o cu cuiele lui, doar că acum avea o singură noapte la dispoziție pentru a o face. Noaptea era foarte rece. Și o făcea în palton, cu respirația vizibilă și fără ca cineva treaz să-l vadă.</w:t>
       </w:r>
     </w:p>
     <w:p/>
@@ -5691,12 +5691,12 @@
     </w:p>
     <w:p>
       <w:r>
-        <w:t>Nu i-am mulțumit. Îmi ceruse odată, fără să ceară, să nu fie lăudat, și n-aveam de gând să schimb termenii aceia într-o cameră rece la miezul nopții. Nici nu l-am absolvit. Nu era treaba mea să o dau și el n-o ceruse, iar răul pe care îl făcuse luna trecută era tot răul pe care îl făcuse, stând în amintirile oamenilor unde îi era locul. Dar mi-am scos paltonul și l-am agățat pe un scaun. M-am lăsat în genunchi pe podeaua udă lângă el și am întins mâna după următoarea cutie îmbibată. I-am ținut de urât fără un cuvânt. Era singurul lucru pe care îl aveam și care merita dat.</w:t>
-      </w:r>
-    </w:p>
-    <w:p>
-      <w:r>
-        <w:t>Am muncit multă vreme, noi doi, cu reșoul ticăind și fierul rece și crăpat tăcut în beciul de dedesubt. La lumina unei singure lămpi împrumutate, două perechi de mâini au salvat ce au putut din vechile hârtii ale orașului de ger. Clădirea nu era întunecată. Nu era goală.</w:t>
+        <w:t>Nu i-am mulțumit. Îmi ceruse odată, fără să ceară, să nu fie lăudat, și n-aveam de gând să schimb termenii aceia într-o cameră rece la miezul nopții. Nici nu l-am absolvit. Iertarea nu era a mea s-o dau, și el n-o ceruse, iar răul pe care îl făcuse luna trecută era tot răul pe care îl făcuse, stând în amintirile oamenilor unde îi era locul. Dar mi-am scos paltonul și l-am agățat pe un scaun. M-am lăsat în genunchi pe podeaua udă lângă el și am întins mâna după următoarea cutie îmbibată. I-am ținut de urât fără un cuvânt. Era singurul lucru pe care îl aveam și care merita dat.</w:t>
+      </w:r>
+    </w:p>
+    <w:p>
+      <w:r>
+        <w:t>Am muncit multă vreme, noi doi, cu sobița ticăind și fierul rece și crăpat tăcut în beciul de dedesubt. La lumina unei singure lămpi împrumutate, două perechi de mâini au salvat ce au putut din vechile hârtii ale orașului de ger. Clădirea nu era întunecată. Nu era goală.</w:t>
       </w:r>
     </w:p>
     <w:p>
@@ -5922,7 +5922,7 @@
     </w:p>
     <w:p>
       <w:r>
-        <w:t>Nick s-a lăsat pe spătar departe de fundul de lemn și s-a uitat la cele două solnițe una lângă alta. — Deci închiderea a fost cronometrată în funcție de deschidere.</w:t>
+        <w:t>Nick s-a lăsat pe spătar departe de fundul de lemn și s-a uitat la cele două solnițe una lângă alta. — Deci închiderea a fost potrivită după deschidere.</w:t>
       </w:r>
     </w:p>
     <w:p>
@@ -6094,7 +6094,7 @@
     <w:p/>
     <w:p>
       <w:r>
-        <w:t>— Partea cu chiuveta tot n-a sosit, a zis ea, înainte să apuc să spun bună ziua. Tom a pus garnitura joi. Am etanșat rosturile singură. Iar inspectorul de la județ nu se întoarce până nu e gata chiuveta. S-a întors în spatele tejghelei. — Așază-te. O să pun ibricul pe foc. N-am cu ce să te servesc alături.</w:t>
+        <w:t>— Piesa pentru chiuvetă tot n-a sosit, a zis ea, înainte să apuc să spun bună ziua. Tom a pus garnitura joi. Am etanșat rosturile singură. Iar inspectorul de la județ nu se întoarce până nu e gata chiuveta. S-a întors în spatele tejghelei. — Așază-te. O să pun ibricul pe foc. N-am cu ce să te servesc alături.</w:t>
       </w:r>
     </w:p>
     <w:p/>
@@ -6244,7 +6244,7 @@
     <w:p/>
     <w:p>
       <w:r>
-        <w:t>Prin deschiderea bucătăriei puteam vedea mătura cu coadă lungă agățată în cuiul ei de lângă ușa din spate, la un pas de locul unde banda de sub ușă se tocise, iar rostul de la baza peretelui din fund crăpase.</w:t>
+        <w:t>Prin deschiderea bucătăriei puteam vedea mătura cu coadă lungă agățată în cuiul ei de lângă ușa din spate, la un pas de locul unde garnitura de sub ușă se tocise, iar rostul de la baza peretelui din fund crăpase.</w:t>
       </w:r>
     </w:p>
     <w:p/>
@@ -6379,7 +6379,7 @@
     </w:p>
     <w:p>
       <w:r>
-        <w:t>— De la Pelkey’s, din Lewiston. Toate brutăriile en-gros de pe partea asta a munților cumpără de la Pelkey’s. Ea a tras aer în piept. Joyce însăși ne-a deschis contul acolo în primul an și l-a luat cu ea când a plecat, și n-are de gând să-l schimbe. Joyce s-ar certa mai curând cu un furnizor decât să renunțe la unul. Încă o respirație. Să nu treci pe la mine azi. Și nici să nu fii drăguță cu mine la telefon. N-am cum să suport asta.</w:t>
+        <w:t>— De la Pelkey’s, din Lewiston. Toate brutăriile en-gros de pe partea asta a munților cumpără de la Pelkey’s. Ea a tras aer în piept. Joyce însăși ne-a deschis contul acolo în primul an și l-a luat cu ea când a plecat, și sigur nu l-a schimbat de atunci. Joyce s-ar certa mai curând cu un furnizor decât să renunțe la unul. Încă o respirație. Să nu treci pe la mine azi. Și nici să nu fii drăguță cu mine la telefon. N-am cum să suport asta.</w:t>
       </w:r>
     </w:p>
     <w:p>
@@ -6745,7 +6745,7 @@
     </w:p>
     <w:p>
       <w:r>
-        <w:t>Așa că totul avea să meargă pe căile legale, la un birou și la o femeie a cărei muncă era să verifice ce jurau oamenii. Dacă o singură bucățică din asta era greșită, avea s-o găsească înainte ca cineva să pățească ceva. Dacă era solid, avea să fie pe hârtie, iar numele Gretei avea să i se facă dreptate tot pe hârtie, unde nimeni nu putea să-l conteste peste tejghea.</w:t>
+        <w:t>Așa că totul avea să meargă pe căile legale, la un birou și la o femeie a cărei muncă era să verifice ce jurau oamenii. Dacă o singură bucățică din asta era greșită, avea s-o găsească înainte ca cineva să pățească ceva. Dacă era solid, avea să fie pe hârtie, iar Greta avea să-și primească numele înapoi tot pe hârtie, unde nimeni nu putea să-l conteste peste tejghea.</w:t>
       </w:r>
     </w:p>
     <w:p>
@@ -7339,7 +7339,7 @@
     </w:p>
     <w:p>
       <w:r>
-        <w:t>— Te-am plătit, a zis ea. Te-am plătit în fiecare lună timp de opt ani, Joyce, iar în unele dintre lunile acelea te-am plătit înainte să plătesc păcura, și încă mai am chitanțele într-o cutie de pantofi dacă șefa vrea să le citească. M-ai rugat să te cumpăr. Ai stat în bucătăria aceea și mi-ai spus că te-ai săturat de moarte de plăcintă la patru dimineața, că vrei pâine, pâine adevărată, en-gros, camioane, clienți, și eu am spus fie. Și te-am plătit.</w:t>
+        <w:t>— Te-am plătit, a zis ea. Te-am plătit în fiecare lună timp de opt ani, Joyce, iar în unele dintre lunile acelea te-am plătit înainte să plătesc păcura, și încă mai am chitanțele într-o cutie de pantofi dacă șefa vrea să le citească. M-ai rugat să-ți cumpăr partea. Ai stat în bucătăria aceea și mi-ai spus că te-ai săturat de moarte de plăcintă la patru dimineața, că vrei pâine, pâine adevărată, en-gros, camioane, clienți, și eu am spus fie. Și te-am plătit.</w:t>
       </w:r>
     </w:p>
     <w:p>
@@ -7364,7 +7364,7 @@
     </w:p>
     <w:p>
       <w:r>
-        <w:t>— Te-am lăsat să pleci, a zis în cele din urmă Greta, iar asprimea dispăruse din glasul ei. Așa e. Îți dau dreptate. Ne-am certat din cauza cuptoarelor, ne-am certat din cauza firmei, ne-am certat din cauza deschiderii duminicile, iar când ai spus că vrei să ieși, m-am bucurat, Dumnezeu să-mi ierte păcatele, m-am bucurat să am o singură bucătărie și un singur mod de a face lucrurile în ea. Ar fi trebuit să te bat la cap să rămâi. N-am făcut-o. Asta e a mea. A tras aer în piept. Și cartonașul a fost Theo care mi-a cerut ceva de adăugat, iar eu l-am scris la tejghea între clienți, fără nicio secundă de gândire în capul meu. Nu m-am gândit la tine. Și asta e a mea.</w:t>
+        <w:t>— Te-am lăsat să pleci, a zis în cele din urmă Greta, iar asprimea dispăruse din glasul ei. Așa e. Îți dau dreptate. Ne-am certat din cauza cuptoarelor, ne-am certat din cauza firmei, ne-am certat din cauza deschiderii duminicile, iar când ai spus că vrei să ieși, m-am bucurat, Dumnezeu să-mi ierte păcatele, m-am bucurat să am o singură bucătărie și un singur mod de a face lucrurile în ea. Ar fi trebuit să te bat la cap să rămâi. N-am făcut-o. Asta e vina mea. A tras aer în piept. Și cartonașul a fost Theo care mi-a cerut ceva de adăugat, iar eu l-am scris la tejghea între clienți, fără nicio secundă de gândire în capul meu. Nu m-am gândit la tine. Și asta e vina mea.</w:t>
       </w:r>
     </w:p>
     <w:p>
@@ -7452,12 +7452,12 @@
     </w:p>
     <w:p>
       <w:r>
-        <w:t>Tanaka și-a luat stiloul din nou, iar scârțâitul mic și cinstit al acestuia a continuat o bucată de vreme. A cântărit fiecare faptă de două ori înainte s-o aștearnă pe hârtie, repetând-o în șoaptă.</w:t>
-      </w:r>
-    </w:p>
-    <w:p>
-      <w:r>
-        <w:t xml:space="preserve">— O să aveți nevoie de un avocat acum, doamnă Wendt, a zis ea, nu fără o anume blândețe. Este dreptul dumneavoastră și l-aș folosi în locul dumneavoastră. Dar o să fiu limpede în privința asta, ca să nu se confunde nimeni mai târziu. Tot ce am este un registru de la furnizor cu semnătura dumneavoastră pe el, o potrivire făcută de chimist, un registru de stat, un bărbat care vă cunoaște duba și două femei pe care brutăria dumneavoastră le-a sunat cu comenzi dintr-un caiet pe care n-aveați niciun drept să-l citiți. Totul scris negru pe alb. Nimic din toate astea nu cere să recunoașteți ceva. A lăsat stiloul jos. Orice ați regreta în după-amiaza asta, și cred că există ceva, nu schimbă nicio iotă de pe pagină. Veți fi pusă sub acuzare astăzi. Sunați-vă avocatul, veniți înapoi cu el până la șase, și vom face restul lucrurilor în liniște.</w:t>
+        <w:t>Tanaka și-a luat stiloul din nou, iar scârțâitul mic și cinstit al acestuia a continuat o bucată de vreme. A cântărit fiecare fapt de două ori înainte s-o aștearnă pe hârtie, repetând-o în șoaptă.</w:t>
+      </w:r>
+    </w:p>
+    <w:p>
+      <w:r>
+        <w:t xml:space="preserve">— O să aveți nevoie de un avocat acum, doamnă Wendt, a zis ea, nu fără o anume blândețe. Este dreptul dumneavoastră și l-aș folosi în locul dumneavoastră. Dar o să fiu limpede în privința asta, ca să nu se confunde nimeni mai târziu. Ce am eu este un registru de la furnizor cu semnătura dumneavoastră pe el, o potrivire făcută de chimist, un registru de stat, un bărbat care vă cunoaște duba și două femei pe care brutăria dumneavoastră le-a sunat cu comenzi dintr-un caiet pe care n-aveați niciun drept să-l citiți. Totul scris negru pe alb. Nimic din toate astea nu cere să recunoașteți ceva. A lăsat stiloul jos. Orice ați regreta în după-amiaza asta, și cred că există ceva, nu schimbă nicio iotă de pe pagină. Veți fi pusă sub acuzare astăzi. Sunați-vă avocatul, veniți înapoi cu el până la șase, și vom face restul lucrurilor în liniște.</w:t>
       </w:r>
     </w:p>
     <w:p>
@@ -7540,7 +7540,7 @@
     <w:p/>
     <w:p>
       <w:r>
-        <w:t>— Două capete de acuzare, a spus Tanaka, deschizându-și carnețelul pe sugativă. Distrugere de bunuri. Aici intră făina, baza acră pe care a pus-o în ea ca să strice patru șarje din aluatul Gretei. Geamul se adaugă la asta. Cărămida o adusese chiar ea de pe raftul din spatele magazinului Gretei, pe alee, duminică, și o comparase cu molozul încă îngrămădit în containerul din spatele cofetăriei Sugarplum. Aceeași cărămidă roșie veche, cu același mortar gri pe o parte. Vopseaua nu e a ei. Acolo e vorba de băieți cu un spray, e o chestiune minoră.</w:t>
+        <w:t>— Două capete de acuzare, a spus Tanaka, deschizându-și carnețelul pe sugativă. Distrugere de bunuri. Aici intră făina, baza acră pe care a pus-o în ea ca să strice patru șarje din aluatul Gretei. Geamul se adaugă la asta. Cărămida o adusese chiar ea de pe raftul din spatele magazinului Gretei, pe alee, duminică, și o comparase cu molozul încă îngrămădit în containerul din spatele lui Sugarplum. Aceeași cărămidă roșie veche, cu același mortar gri pe o parte. Vopseaua nu e a ei. Acolo e vorba de băieți cu un spray, e o chestiune minoră.</w:t>
       </w:r>
     </w:p>
     <w:p/>
@@ -7594,7 +7594,7 @@
     <w:p/>
     <w:p>
       <w:r>
-        <w:t>— Mai e și celălalt aspect, a spus Tanaka. Wendt deține o licență de stat pentru a vinde pâine en-gros. Când proprietarul unei afaceri alimentare licențiate e acuzat că a alterat alimente, cred că statul trebuie să afle de la mine, așa că le-am spus aseară. Inspectorul lor a fost la ușa ei înainte de zori, în dimineața asta.</w:t>
+        <w:t>— Mai e și celălalt aspect, a spus Tanaka. Brutăria Wendt deține o licență de stat pentru a vinde pâine en-gros. Când proprietarul unei afaceri alimentare licențiate e acuzat că a alterat alimente, cred că statul trebuie să afle de la mine, așa că le-am spus aseară. Inspectorul lor a fost la ușa ei înainte de zori, în dimineața asta.</w:t>
       </w:r>
     </w:p>
     <w:p/>
@@ -7856,7 +7856,7 @@
     <w:p/>
     <w:p>
       <w:r>
-        <w:t>Vestea s-a răspândit prin Frost Falls până la prânz la fel de repede pe cât se împrăștiase și îndoiala, doar că de data asta a adus căldură. Nu era făina ei. N-a fost făina ei niciodată. Era Joyce Wendt de pe-acolo din Bridgton, vechea ei parteneră, cea care adusese pâinea la căminul cultural. Acrise făina cu premeditare și mințise județul ca s-o închidă, iar doamna Claus o prinsese cu ajutorul unui pinguin. Partea asta din urmă a mai crescut puțin la fiecare povestire, iar eu am lăsat-o în pace. Când a ajuns la capătul celălalt al străzii Evergreen, o arăta pe Pip făcând niște giumbușlucuri pe care nu le-ar fi crezut nimeni.</w:t>
+        <w:t>Vestea s-a răspândit prin Frost Falls până la prânz la fel de repede pe cât se împrăștiase și îndoiala, doar că de data asta a adus căldură. Nu era făina ei. N-a fost făina ei niciodată. Era Joyce Wendt de pe-acolo din Bridgton, vechea ei parteneră, cea care adusese pâinea la căminul cultural. Acrise făina cu premeditare și mințise județul ca s-o închidă, iar doamna Claus o prinsese cu ajutorul unui pinguin. Partea asta din urmă a mai crescut puțin la fiecare povestire, iar eu am lăsat-o în pace. Când a ajuns la capătul celălalt al Bulevardului Evergreen, o arăta pe Pip făcând niște giumbușlucuri pe care nu le-ar fi crezut nimeni.</w:t>
       </w:r>
     </w:p>
     <w:p/>
@@ -7868,7 +7868,7 @@
     <w:p/>
     <w:p>
       <w:r>
-        <w:t>Oamenii de pe-aici duc supă la o casă prin care a trecut boala. Nu mai rămăsese niciun bolnav pe care să-l hrănească, așa că i-au golit rafturile în schimb. Pe la două, coada ieșea pe ușa de la Holly Jolly și ținea jumătate de stradă, bătând din picioare de frig. Greta aprinsese fiecare cuptor, iar aburul se așezase pe geam atât de gros încât nu mai puteai citi HOLLY JOLLY de pe stradă. Chiflele cu cacao s-au terminat până la două și jumătate. Fursecurile cu ghimbir s-au dus până la fundul borcanului. S-a apucat de o șarjă de rulouri cu scorțișoară la ora trei, deși n-avea niciun motiv să se apuce atât de târziu, și le-a vândut pe toate fierbinți și neglazurate, înainte să se răcească.</w:t>
+        <w:t>Oamenii de pe-aici duc supă la o casă prin care a trecut boala. Nu mai rămăsese niciun bolnav pe care să-l hrănească, așa că i-au golit rafturile în schimb. Pe la două, coada ieșea pe ușa de la Holly Jolly și ținea jumătate de stradă, bătând din picioare de frig. Greta aprinsese fiecare cuptor, iar aburul se așezase pe geam atât de gros încât nu mai puteai citi HOLLY JOLLY de pe stradă. Chiflele cu cacao s-au terminat până la două și jumătate. Biscuiții cu ghimbir s-au dus până la fundul borcanului. S-a apucat de o șarjă de rulouri cu scorțișoară la ora trei, deși n-avea niciun motiv să se apuce atât de târziu, și le-a vândut pe toate fierbinți și neglazurate, înainte să se răcească.</w:t>
       </w:r>
     </w:p>
     <w:p/>
@@ -8245,7 +8245,7 @@
     </w:p>
     <w:p>
       <w:r>
-        <w:t>Nicio panglică. Niciun discurs. Hal și-a îndreptat foaia și și-a închis tăblița. Sam și-a șters mâinile negre. Pete și-a băut cafeaua rece. Greta a îndesat ultimele chifle cu cacao în gura echipei de pe acoperiș, iar când Hal a deschis gura despre banii pe care îi dăduse, i-a îndesat o chiflă și lui.</w:t>
+        <w:t>Nicio panglică. Niciun discurs. Hal și-a îndreptat foaia și și-a închis tăblița. Sam și-a șters mâinile negre. Pete și-a băut cafeaua rece. Greta le-a împărțit cu de-a sila celor din echipa de pe acoperiș ultimele chifle cu cacao, iar când Hal a deschis gura despre banii pe care îi dăduse, i-a îndesat una în gură.</w:t>
       </w:r>
     </w:p>
     <w:p>
@@ -8338,7 +8338,7 @@
     </w:p>
     <w:p>
       <w:r>
-        <w:t>Cercul a depus o mică coroniță pe care o împletiserăm din balsam uscat și boabe, același verde pe care îl atârnaserăm la fiecare fereastră.</w:t>
+        <w:t>Cercul a depus o mică coroniță pe care o împletiserăm din cetină uscată și boabe, același verde pe care îl atârnaserăm la fiecare fereastră.</w:t>
       </w:r>
     </w:p>
     <w:p>
@@ -8363,7 +8363,7 @@
     </w:p>
     <w:p>
       <w:r>
-        <w:t>— Nu mai vine, i-a spus ea cutiei și încăperii. Așa că o poate avea fata de peste o sută de ani. O să aibă și ea mâinile reci. Toată lumea le are, aici.</w:t>
+        <w:t>— Nu-mi mai vine, i-a spus ea cutiei și încăperii. Așa că o poate avea fata de peste o sută de ani. O să aibă și ea mâinile reci. Toată lumea le are, aici.</w:t>
       </w:r>
     </w:p>
     <w:p>
@@ -8428,7 +8428,7 @@
     </w:p>
     <w:p>
       <w:r>
-        <w:t>— Să o câștige așa cum am făcut-o eu, a spus ea, seacă, pentru sala care râdea. Fiind o familie sau găsind-o într-o cutie.</w:t>
+        <w:t>— Să o câștige așa cum am făcut-o eu, a spus ea, seacă, pentru sala care râdea. Fiind din familie sau găsind-o într-o cutie.</w:t>
       </w:r>
     </w:p>
     <w:p>
@@ -8500,7 +8500,7 @@
     <w:p/>
     <w:p>
       <w:r>
-        <w:t>La Holly Jolly erau pornite toate cele șase cuptoare în dimineața în care am coborât după comanda obișnuită de coronițe a cercului. Căldura lor de la ușă m-a făcut să rămân fără aer — o mângâiere plăcută după un drum pe frig —, așa că am stat o clipă pe preș lăsându-mă învăluită de ea.</w:t>
+        <w:t>La Holly Jolly erau pornite toate cele șase cuptoare în dimineața în care am coborât după comanda obișnuită a cercului de coronițe. Căldura lor de la ușă m-a făcut să rămân fără aer — o mângâiere plăcută după un drum pe frig —, așa că am stat o clipă pe preș lăsându-mă învăluită de ea.</w:t>
       </w:r>
     </w:p>
     <w:p/>
@@ -8512,7 +8512,7 @@
     <w:p/>
     <w:p>
       <w:r>
-        <w:t xml:space="preserve">— Ai venit devreme, a spus Greta fără să ridice privirea, împingând tava la loc și închizând cuptorul cu șoldul. Comanda de coronițe nu e împachetată. Așază-te. Ia ceva. Am scos o pâine cu mirodenii care așteaptă o părere.</w:t>
+        <w:t xml:space="preserve">— Ai venit devreme, a spus Greta fără să ridice privirea, împingând tava la loc și închizând cuptorul cu șoldul. Comanda pentru cerc nu e împachetată. Așază-te. Ia ceva. Am scos o pâine cu mirodenii care așteaptă o părere.</w:t>
       </w:r>
     </w:p>
     <w:p/>
@@ -8661,7 +8661,7 @@
     <w:p/>
     <w:p>
       <w:r>
-        <w:t>Pip intrase de acolo de unde supraveghease zăpada prin geamul jos și se așezase la picioarele Gretei cu îndrăzneala nerușinată a unei păsări care considera că o brutărie repusă în drepturi îi datora solde restante. Greta s-a uitat în jos la ea preț de o clipă lungă.</w:t>
+        <w:t>Pip a venit de acolo de unde supraveghease zăpada prin geamul jos și s-a așezat la picioarele Gretei cu îndrăzneala nerușinată a unei păsări care considera că o brutărie repusă în drepturi îi datora solde restante. Greta s-a uitat în jos la ea preț de o clipă lungă.</w:t>
       </w:r>
     </w:p>
     <w:p/>
@@ -8709,7 +8709,7 @@
     <w:p/>
     <w:p>
       <w:r>
-        <w:t xml:space="preserve">O lăsasem pe Pip sub scaun cu ultima bucată din sardină, să aibă grijă de ea însăși când termina, și am dus comanda de coronițe pe bulevard spre Societate. Cele două treburi erau în aceeași direcție și voiam să văd din nou cutia în noua ei siguranță.</w:t>
+        <w:t xml:space="preserve">Am lăsat-o pe Pip sub scaun cu ultima bucată din sardină, să-și vadă singură de drum spre casă când termina, și am dus comanda cercului pe bulevard spre Societate. Cele două treburi erau în aceeași direcție și voiam să văd din nou cutia în noua ei siguranță.</w:t>
       </w:r>
     </w:p>
     <w:p/>
@@ -8880,7 +8880,7 @@
     </w:p>
     <w:p>
       <w:r>
-        <w:t>Moștenirea unei străbunici răposate îi oferă o ieșire — o prăfuită prăvălie de legătorie din Pinecrest, un orășel ca de carte poștală, a ei ca s-o vândă și s-o uite. Apoi președinta Societății de Istorie se prăbușește la Balul Mascat al Clarului de Lună, strângând în mână un mic jurnal din piele, iar șeriful o roagă pe Fiona să-l examineze.</w:t>
+        <w:t>Moștenirea unei mătuși bunice răposate îi oferă o ieșire — o prăfuită prăvălie de legătorie din Pinecrest, un orășel ca de carte poștală, a ei ca s-o vândă și s-o uite. Apoi președinta Societății de Istorie se prăbușește la Balul Mascat al Clarului de Lună, strângând în mână un mic jurnal din piele, iar șeriful o roagă pe Fiona să-l examineze.</w:t>
       </w:r>
     </w:p>
     <w:p>

</xml_diff>